<commit_message>
docs: Word buoc 3 them muc operator, roadmap v3 cap nhat sau feedback Thay 22/09
Co-Authored-By: Claude Opus 5 <noreply@anthropic.com>
Claude-Session: https://claude.ai/code/session_01XDEwCyCYJk3UKpHYKnxnkU
</commit_message>
<xml_diff>
--- a/docs/buoc3-giai-thich-y-nghia.docx
+++ b/docs/buoc3-giai-thich-y-nghia.docx
@@ -251,13 +251,13 @@
           <w:sz w:val="22"/>
           <w:szCs w:val="22"/>
         </w:rPr>
-        <w:t xml:space="preserve">5. Tham số — tăng hoặc giảm thì khác gì</w:t>
+        <w:t xml:space="preserve">5. Sáu operator trên đường inference</w:t>
       </w:r>
     </w:p>
     <w:p>
       <w:pPr>
         <w:spacing w:after="60"/>
-        <w:ind w:left="0"/>
+        <w:ind w:left="320"/>
       </w:pPr>
       <w:r>
         <w:rPr>
@@ -268,13 +268,13 @@
           <w:sz w:val="22"/>
           <w:szCs w:val="22"/>
         </w:rPr>
-        <w:t xml:space="preserve">5.1 Nhóm ĐỔI số tham số — sửa kiến trúc</w:t>
+        <w:t xml:space="preserve">5.1 Đường inference đầy đủ — 12 bước, 6 operator</w:t>
       </w:r>
     </w:p>
     <w:p>
       <w:pPr>
         <w:spacing w:after="60"/>
-        <w:ind w:left="0"/>
+        <w:ind w:left="320"/>
       </w:pPr>
       <w:r>
         <w:rPr>
@@ -285,13 +285,13 @@
           <w:sz w:val="22"/>
           <w:szCs w:val="22"/>
         </w:rPr>
-        <w:t xml:space="preserve">5.2 Nhóm KHÔNG đổi số tham số — chỉ đổi cách học</w:t>
+        <w:t xml:space="preserve">5.2 Mã giả — viết được thành C ngay</w:t>
       </w:r>
     </w:p>
     <w:p>
       <w:pPr>
         <w:spacing w:after="60"/>
-        <w:ind w:left="0"/>
+        <w:ind w:left="320"/>
       </w:pPr>
       <w:r>
         <w:rPr>
@@ -302,13 +302,13 @@
           <w:sz w:val="22"/>
           <w:szCs w:val="22"/>
         </w:rPr>
-        <w:t xml:space="preserve">5.3 Ví dụ tính tay: đổi padding từ 1 xuống 0</w:t>
+        <w:t xml:space="preserve">5.3 Hai chỗ bỏ được phép toán, không mất một bit nào</w:t>
       </w:r>
     </w:p>
     <w:p>
       <w:pPr>
         <w:spacing w:after="60"/>
-        <w:ind w:left="0"/>
+        <w:ind w:left="320"/>
       </w:pPr>
       <w:r>
         <w:rPr>
@@ -319,7 +319,7 @@
           <w:sz w:val="22"/>
           <w:szCs w:val="22"/>
         </w:rPr>
-        <w:t xml:space="preserve">6. Đọc kết quả</w:t>
+        <w:t xml:space="preserve">5.4 Ba bẫy khi port sang C</w:t>
       </w:r>
     </w:p>
     <w:p>
@@ -336,7 +336,126 @@
           <w:sz w:val="22"/>
           <w:szCs w:val="22"/>
         </w:rPr>
-        <w:t xml:space="preserve">7. Bảng tra nhanh</w:t>
+        <w:t xml:space="preserve">6. Tham số — tăng hoặc giảm thì khác gì</w:t>
+      </w:r>
+    </w:p>
+    <w:p>
+      <w:pPr>
+        <w:spacing w:after="60"/>
+        <w:ind w:left="0"/>
+      </w:pPr>
+      <w:r>
+        <w:rPr>
+          <w:rFonts w:ascii="Calibri" w:cs="Calibri" w:eastAsia="Calibri" w:hAnsi="Calibri"/>
+          <w:b/>
+          <w:bCs/>
+          <w:color w:val="0F2A44"/>
+          <w:sz w:val="22"/>
+          <w:szCs w:val="22"/>
+        </w:rPr>
+        <w:t xml:space="preserve">6.1 Nhóm ĐỔI số tham số — sửa kiến trúc</w:t>
+      </w:r>
+    </w:p>
+    <w:p>
+      <w:pPr>
+        <w:spacing w:after="60"/>
+        <w:ind w:left="0"/>
+      </w:pPr>
+      <w:r>
+        <w:rPr>
+          <w:rFonts w:ascii="Calibri" w:cs="Calibri" w:eastAsia="Calibri" w:hAnsi="Calibri"/>
+          <w:b/>
+          <w:bCs/>
+          <w:color w:val="0F2A44"/>
+          <w:sz w:val="22"/>
+          <w:szCs w:val="22"/>
+        </w:rPr>
+        <w:t xml:space="preserve">6.2 Nhóm KHÔNG đổi số tham số — chỉ đổi cách học</w:t>
+      </w:r>
+    </w:p>
+    <w:p>
+      <w:pPr>
+        <w:spacing w:after="60"/>
+        <w:ind w:left="0"/>
+      </w:pPr>
+      <w:r>
+        <w:rPr>
+          <w:rFonts w:ascii="Calibri" w:cs="Calibri" w:eastAsia="Calibri" w:hAnsi="Calibri"/>
+          <w:b/>
+          <w:bCs/>
+          <w:color w:val="0F2A44"/>
+          <w:sz w:val="22"/>
+          <w:szCs w:val="22"/>
+        </w:rPr>
+        <w:t xml:space="preserve">6.3 Ví dụ tính tay: đổi padding từ 1 xuống 0</w:t>
+      </w:r>
+    </w:p>
+    <w:p>
+      <w:pPr>
+        <w:spacing w:after="60"/>
+        <w:ind w:left="0"/>
+      </w:pPr>
+      <w:r>
+        <w:rPr>
+          <w:rFonts w:ascii="Calibri" w:cs="Calibri" w:eastAsia="Calibri" w:hAnsi="Calibri"/>
+          <w:b/>
+          <w:bCs/>
+          <w:color w:val="0F2A44"/>
+          <w:sz w:val="22"/>
+          <w:szCs w:val="22"/>
+        </w:rPr>
+        <w:t xml:space="preserve">6.4 Biến thể: chỉ đổi padding của conv1</w:t>
+      </w:r>
+    </w:p>
+    <w:p>
+      <w:pPr>
+        <w:spacing w:after="60"/>
+        <w:ind w:left="0"/>
+      </w:pPr>
+      <w:r>
+        <w:rPr>
+          <w:rFonts w:ascii="Calibri" w:cs="Calibri" w:eastAsia="Calibri" w:hAnsi="Calibri"/>
+          <w:b/>
+          <w:bCs/>
+          <w:color w:val="0F2A44"/>
+          <w:sz w:val="22"/>
+          <w:szCs w:val="22"/>
+        </w:rPr>
+        <w:t xml:space="preserve">7. Đọc kết quả</w:t>
+      </w:r>
+    </w:p>
+    <w:p>
+      <w:pPr>
+        <w:spacing w:after="60"/>
+        <w:ind w:left="320"/>
+      </w:pPr>
+      <w:r>
+        <w:rPr>
+          <w:rFonts w:ascii="Calibri" w:cs="Calibri" w:eastAsia="Calibri" w:hAnsi="Calibri"/>
+          <w:b/>
+          <w:bCs/>
+          <w:color w:val="0F2A44"/>
+          <w:sz w:val="22"/>
+          <w:szCs w:val="22"/>
+        </w:rPr>
+        <w:t xml:space="preserve">7.1 Cắt 41 lần tham số thì model nhầm khác đi thế nào</w:t>
+      </w:r>
+    </w:p>
+    <w:p>
+      <w:pPr>
+        <w:spacing w:after="60"/>
+        <w:ind w:left="0"/>
+      </w:pPr>
+      <w:r>
+        <w:rPr>
+          <w:rFonts w:ascii="Calibri" w:cs="Calibri" w:eastAsia="Calibri" w:hAnsi="Calibri"/>
+          <w:b/>
+          <w:bCs/>
+          <w:color w:val="0F2A44"/>
+          <w:sz w:val="22"/>
+          <w:szCs w:val="22"/>
+        </w:rPr>
+        <w:t xml:space="preserve">8. Bảng tra nhanh</w:t>
       </w:r>
     </w:p>
     <w:p>
@@ -5324,7 +5443,2566 @@
         <w:pStyle w:val="Heading1"/>
       </w:pPr>
       <w:r>
-        <w:t xml:space="preserve">5. Tham số — tăng hoặc giảm thì khác gì</w:t>
+        <w:t xml:space="preserve">5. Sáu operator trên đường inference</w:t>
+      </w:r>
+    </w:p>
+    <w:p>
+      <w:pPr>
+        <w:spacing w:after="120" w:before="0"/>
+      </w:pPr>
+      <w:r>
+        <w:rPr>
+          <w:rFonts w:ascii="Calibri" w:cs="Calibri" w:eastAsia="Calibri" w:hAnsi="Calibri"/>
+          <w:color w:val="1A2733"/>
+          <w:sz w:val="22"/>
+          <w:szCs w:val="22"/>
+        </w:rPr>
+        <w:t xml:space="preserve">Mục 4 giải thích từng lớp và công thức của nó. Mục này trả lời một câu hỏi khác và hẹp hơn: sau khi train xong, model thật sự thực hiện những phép toán nào? Đây chính là danh sách đầy đủ những gì bản golden model viết bằng C phải hiện thực — không thiếu, và cũng không được thừa.</w:t>
+      </w:r>
+    </w:p>
+    <w:p>
+      <w:pPr>
+        <w:pBdr>
+          <w:left w:val="single" w:color="1C7293" w:sz="12" w:space="8"/>
+        </w:pBdr>
+        <w:shd w:fill="F7FAFB" w:val="clear"/>
+        <w:spacing w:after="180" w:before="100"/>
+        <w:ind w:left="160" w:right="160"/>
+      </w:pPr>
+      <w:r>
+        <w:rPr>
+          <w:rFonts w:ascii="Calibri" w:cs="Calibri" w:eastAsia="Calibri" w:hAnsi="Calibri"/>
+          <w:i/>
+          <w:iCs/>
+          <w:color w:val="5F7183"/>
+          <w:sz w:val="21"/>
+          <w:szCs w:val="21"/>
+        </w:rPr>
+        <w:t xml:space="preserve">Phân biệt hai đường đi. Đường train gồm loss, optimizer, backward, dropout. Đường inference chỉ là forward. Chip chỉ chạy đường inference, nên mọi thứ thuộc đường train không cần port sang C. Nhầm hai đường này là lý do người ta hay hiện thực softmax hoặc CrossEntropyLoss trên phần cứng một cách vô ích.</w:t>
+      </w:r>
+    </w:p>
+    <w:p>
+      <w:pPr>
+        <w:pStyle w:val="Heading2"/>
+      </w:pPr>
+      <w:r>
+        <w:t xml:space="preserve">5.1 Đường inference đầy đủ — 12 bước, 6 operator</w:t>
+      </w:r>
+    </w:p>
+    <w:p>
+      <w:pPr>
+        <w:spacing w:after="120" w:before="0"/>
+      </w:pPr>
+      <w:r>
+        <w:rPr>
+          <w:rFonts w:ascii="Calibri" w:cs="Calibri" w:eastAsia="Calibri" w:hAnsi="Calibri"/>
+          <w:color w:val="1A2733"/>
+          <w:sz w:val="22"/>
+          <w:szCs w:val="22"/>
+        </w:rPr>
+        <w:t xml:space="preserve">Sau khi train xong, SmallCNN chạy đúng 12 bước này và không có gì khác:</w:t>
+      </w:r>
+    </w:p>
+    <w:p>
+      <w:pPr>
+        <w:shd w:fill="F2F6F8" w:val="clear"/>
+        <w:spacing w:after="0" w:before="100"/>
+        <w:ind w:left="200" w:right="200"/>
+      </w:pPr>
+      <w:r>
+        <w:rPr>
+          <w:rFonts w:ascii="Courier New" w:cs="Courier New" w:eastAsia="Courier New" w:hAnsi="Courier New"/>
+          <w:color w:val="0F2A44"/>
+          <w:sz w:val="19"/>
+          <w:szCs w:val="19"/>
+        </w:rPr>
+        <w:t xml:space="preserve">ảnh 1×28×28</w:t>
+      </w:r>
+    </w:p>
+    <w:p>
+      <w:pPr>
+        <w:shd w:fill="F2F6F8" w:val="clear"/>
+        <w:spacing w:after="0" w:before="0"/>
+        <w:ind w:left="200" w:right="200"/>
+      </w:pPr>
+      <w:r>
+        <w:rPr>
+          <w:rFonts w:ascii="Courier New" w:cs="Courier New" w:eastAsia="Courier New" w:hAnsi="Courier New"/>
+          <w:color w:val="0F2A44"/>
+          <w:sz w:val="19"/>
+          <w:szCs w:val="19"/>
+        </w:rPr>
+        <w:t xml:space="preserve">  conv2d (1→8,  k3, p1)   →  8×28×28</w:t>
+      </w:r>
+    </w:p>
+    <w:p>
+      <w:pPr>
+        <w:shd w:fill="F2F6F8" w:val="clear"/>
+        <w:spacing w:after="0" w:before="0"/>
+        <w:ind w:left="200" w:right="200"/>
+      </w:pPr>
+      <w:r>
+        <w:rPr>
+          <w:rFonts w:ascii="Courier New" w:cs="Courier New" w:eastAsia="Courier New" w:hAnsi="Courier New"/>
+          <w:color w:val="0F2A44"/>
+          <w:sz w:val="19"/>
+          <w:szCs w:val="19"/>
+        </w:rPr>
+        <w:t xml:space="preserve">  relu                    →  8×28×28</w:t>
+      </w:r>
+    </w:p>
+    <w:p>
+      <w:pPr>
+        <w:shd w:fill="F2F6F8" w:val="clear"/>
+        <w:spacing w:after="0" w:before="0"/>
+        <w:ind w:left="200" w:right="200"/>
+      </w:pPr>
+      <w:r>
+        <w:rPr>
+          <w:rFonts w:ascii="Courier New" w:cs="Courier New" w:eastAsia="Courier New" w:hAnsi="Courier New"/>
+          <w:color w:val="0F2A44"/>
+          <w:sz w:val="19"/>
+          <w:szCs w:val="19"/>
+        </w:rPr>
+        <w:t xml:space="preserve">  maxpool (k2, s2)        →  8×14×14</w:t>
+      </w:r>
+    </w:p>
+    <w:p>
+      <w:pPr>
+        <w:shd w:fill="F2F6F8" w:val="clear"/>
+        <w:spacing w:after="0" w:before="0"/>
+        <w:ind w:left="200" w:right="200"/>
+      </w:pPr>
+      <w:r>
+        <w:rPr>
+          <w:rFonts w:ascii="Courier New" w:cs="Courier New" w:eastAsia="Courier New" w:hAnsi="Courier New"/>
+          <w:color w:val="0F2A44"/>
+          <w:sz w:val="19"/>
+          <w:szCs w:val="19"/>
+        </w:rPr>
+        <w:t xml:space="preserve"> </w:t>
+      </w:r>
+    </w:p>
+    <w:p>
+      <w:pPr>
+        <w:shd w:fill="F2F6F8" w:val="clear"/>
+        <w:spacing w:after="0" w:before="0"/>
+        <w:ind w:left="200" w:right="200"/>
+      </w:pPr>
+      <w:r>
+        <w:rPr>
+          <w:rFonts w:ascii="Courier New" w:cs="Courier New" w:eastAsia="Courier New" w:hAnsi="Courier New"/>
+          <w:color w:val="0F2A44"/>
+          <w:sz w:val="19"/>
+          <w:szCs w:val="19"/>
+        </w:rPr>
+        <w:t xml:space="preserve">  conv2d (8→16, k3, p1)   → 16×14×14</w:t>
+      </w:r>
+    </w:p>
+    <w:p>
+      <w:pPr>
+        <w:shd w:fill="F2F6F8" w:val="clear"/>
+        <w:spacing w:after="0" w:before="0"/>
+        <w:ind w:left="200" w:right="200"/>
+      </w:pPr>
+      <w:r>
+        <w:rPr>
+          <w:rFonts w:ascii="Courier New" w:cs="Courier New" w:eastAsia="Courier New" w:hAnsi="Courier New"/>
+          <w:color w:val="0F2A44"/>
+          <w:sz w:val="19"/>
+          <w:szCs w:val="19"/>
+        </w:rPr>
+        <w:t xml:space="preserve">  relu                    → 16×14×14</w:t>
+      </w:r>
+    </w:p>
+    <w:p>
+      <w:pPr>
+        <w:shd w:fill="F2F6F8" w:val="clear"/>
+        <w:spacing w:after="0" w:before="0"/>
+        <w:ind w:left="200" w:right="200"/>
+      </w:pPr>
+      <w:r>
+        <w:rPr>
+          <w:rFonts w:ascii="Courier New" w:cs="Courier New" w:eastAsia="Courier New" w:hAnsi="Courier New"/>
+          <w:color w:val="0F2A44"/>
+          <w:sz w:val="19"/>
+          <w:szCs w:val="19"/>
+        </w:rPr>
+        <w:t xml:space="preserve">  maxpool (k2, s2)        → 16× 7× 7</w:t>
+      </w:r>
+    </w:p>
+    <w:p>
+      <w:pPr>
+        <w:shd w:fill="F2F6F8" w:val="clear"/>
+        <w:spacing w:after="0" w:before="0"/>
+        <w:ind w:left="200" w:right="200"/>
+      </w:pPr>
+      <w:r>
+        <w:rPr>
+          <w:rFonts w:ascii="Courier New" w:cs="Courier New" w:eastAsia="Courier New" w:hAnsi="Courier New"/>
+          <w:color w:val="0F2A44"/>
+          <w:sz w:val="19"/>
+          <w:szCs w:val="19"/>
+        </w:rPr>
+        <w:t xml:space="preserve"> </w:t>
+      </w:r>
+    </w:p>
+    <w:p>
+      <w:pPr>
+        <w:shd w:fill="F2F6F8" w:val="clear"/>
+        <w:spacing w:after="0" w:before="0"/>
+        <w:ind w:left="200" w:right="200"/>
+      </w:pPr>
+      <w:r>
+        <w:rPr>
+          <w:rFonts w:ascii="Courier New" w:cs="Courier New" w:eastAsia="Courier New" w:hAnsi="Courier New"/>
+          <w:color w:val="0F2A44"/>
+          <w:sz w:val="19"/>
+          <w:szCs w:val="19"/>
+        </w:rPr>
+        <w:t xml:space="preserve">  conv2d (16→16, k3, p1)  → 16× 7× 7</w:t>
+      </w:r>
+    </w:p>
+    <w:p>
+      <w:pPr>
+        <w:shd w:fill="F2F6F8" w:val="clear"/>
+        <w:spacing w:after="0" w:before="0"/>
+        <w:ind w:left="200" w:right="200"/>
+      </w:pPr>
+      <w:r>
+        <w:rPr>
+          <w:rFonts w:ascii="Courier New" w:cs="Courier New" w:eastAsia="Courier New" w:hAnsi="Courier New"/>
+          <w:color w:val="0F2A44"/>
+          <w:sz w:val="19"/>
+          <w:szCs w:val="19"/>
+        </w:rPr>
+        <w:t xml:space="preserve">  relu                    → 16× 7× 7</w:t>
+      </w:r>
+    </w:p>
+    <w:p>
+      <w:pPr>
+        <w:shd w:fill="F2F6F8" w:val="clear"/>
+        <w:spacing w:after="0" w:before="0"/>
+        <w:ind w:left="200" w:right="200"/>
+      </w:pPr>
+      <w:r>
+        <w:rPr>
+          <w:rFonts w:ascii="Courier New" w:cs="Courier New" w:eastAsia="Courier New" w:hAnsi="Courier New"/>
+          <w:color w:val="0F2A44"/>
+          <w:sz w:val="19"/>
+          <w:szCs w:val="19"/>
+        </w:rPr>
+        <w:t xml:space="preserve">  maxpool (k2, s2)        → 16× 3× 3</w:t>
+      </w:r>
+    </w:p>
+    <w:p>
+      <w:pPr>
+        <w:shd w:fill="F2F6F8" w:val="clear"/>
+        <w:spacing w:after="0" w:before="0"/>
+        <w:ind w:left="200" w:right="200"/>
+      </w:pPr>
+      <w:r>
+        <w:rPr>
+          <w:rFonts w:ascii="Courier New" w:cs="Courier New" w:eastAsia="Courier New" w:hAnsi="Courier New"/>
+          <w:color w:val="0F2A44"/>
+          <w:sz w:val="19"/>
+          <w:szCs w:val="19"/>
+        </w:rPr>
+        <w:t xml:space="preserve"> </w:t>
+      </w:r>
+    </w:p>
+    <w:p>
+      <w:pPr>
+        <w:shd w:fill="F2F6F8" w:val="clear"/>
+        <w:spacing w:after="0" w:before="0"/>
+        <w:ind w:left="200" w:right="200"/>
+      </w:pPr>
+      <w:r>
+        <w:rPr>
+          <w:rFonts w:ascii="Courier New" w:cs="Courier New" w:eastAsia="Courier New" w:hAnsi="Courier New"/>
+          <w:color w:val="0F2A44"/>
+          <w:sz w:val="19"/>
+          <w:szCs w:val="19"/>
+        </w:rPr>
+        <w:t xml:space="preserve">  flatten                 → 144</w:t>
+      </w:r>
+    </w:p>
+    <w:p>
+      <w:pPr>
+        <w:shd w:fill="F2F6F8" w:val="clear"/>
+        <w:spacing w:after="0" w:before="0"/>
+        <w:ind w:left="200" w:right="200"/>
+      </w:pPr>
+      <w:r>
+        <w:rPr>
+          <w:rFonts w:ascii="Courier New" w:cs="Courier New" w:eastAsia="Courier New" w:hAnsi="Courier New"/>
+          <w:color w:val="0F2A44"/>
+          <w:sz w:val="19"/>
+          <w:szCs w:val="19"/>
+        </w:rPr>
+        <w:t xml:space="preserve">  linear  (144→10)        →  10 logit</w:t>
+      </w:r>
+    </w:p>
+    <w:p>
+      <w:pPr>
+        <w:shd w:fill="F2F6F8" w:val="clear"/>
+        <w:spacing w:after="160" w:before="0"/>
+        <w:ind w:left="200" w:right="200"/>
+      </w:pPr>
+      <w:r>
+        <w:rPr>
+          <w:rFonts w:ascii="Courier New" w:cs="Courier New" w:eastAsia="Courier New" w:hAnsi="Courier New"/>
+          <w:color w:val="0F2A44"/>
+          <w:sz w:val="19"/>
+          <w:szCs w:val="19"/>
+        </w:rPr>
+        <w:t xml:space="preserve">  argmax                  →   1 chữ số</w:t>
+      </w:r>
+    </w:p>
+    <w:p>
+      <w:pPr>
+        <w:spacing w:after="120" w:before="0"/>
+      </w:pPr>
+      <w:r>
+        <w:rPr>
+          <w:rFonts w:ascii="Calibri" w:cs="Calibri" w:eastAsia="Calibri" w:hAnsi="Calibri"/>
+          <w:b/>
+          <w:bCs/>
+          <w:color w:val="1A2733"/>
+          <w:sz w:val="22"/>
+          <w:szCs w:val="22"/>
+        </w:rPr>
+        <w:t xml:space="preserve">Chỉ có 6 operator khác nhau. </w:t>
+      </w:r>
+      <w:r>
+        <w:rPr>
+          <w:rFonts w:ascii="Calibri" w:cs="Calibri" w:eastAsia="Calibri" w:hAnsi="Calibri"/>
+          <w:color w:val="1A2733"/>
+          <w:sz w:val="22"/>
+          <w:szCs w:val="22"/>
+        </w:rPr>
+        <w:t xml:space="preserve">Không có softmax, không có loss function, không có optimizer — cả ba chỉ tồn tại lúc train. Bảng dưới là toàn bộ khối lượng công việc của một lần suy luận, đếm trên đúng kiến trúc SmallCNN.</w:t>
+      </w:r>
+    </w:p>
+    <w:tbl>
+      <w:tblPr>
+        <w:tblW w:type="dxa" w:w="9026"/>
+        <w:tblBorders>
+          <w:top w:val="single" w:color="auto" w:sz="4"/>
+          <w:left w:val="single" w:color="auto" w:sz="4"/>
+          <w:bottom w:val="single" w:color="auto" w:sz="4"/>
+          <w:right w:val="single" w:color="auto" w:sz="4"/>
+          <w:insideH w:val="single" w:color="auto" w:sz="4"/>
+          <w:insideV w:val="single" w:color="auto" w:sz="4"/>
+        </w:tblBorders>
+      </w:tblPr>
+      <w:tblGrid>
+        <w:gridCol w:w="1500"/>
+        <w:gridCol w:w="1250"/>
+        <w:gridCol w:w="2400"/>
+        <w:gridCol w:w="3876"/>
+      </w:tblGrid>
+      <w:tr>
+        <w:trPr>
+          <w:tblHeader/>
+        </w:trPr>
+        <w:tc>
+          <w:tcPr>
+            <w:tcW w:type="dxa" w:w="1500"/>
+            <w:shd w:fill="0F2A44" w:val="clear"/>
+            <w:tcMar>
+              <w:top w:type="dxa" w:w="70"/>
+              <w:left w:type="dxa" w:w="110"/>
+              <w:bottom w:type="dxa" w:w="70"/>
+              <w:right w:type="dxa" w:w="110"/>
+            </w:tcMar>
+          </w:tcPr>
+          <w:p>
+            <w:pPr>
+              <w:spacing w:after="0"/>
+            </w:pPr>
+            <w:r>
+              <w:rPr>
+                <w:rFonts w:ascii="Calibri" w:cs="Calibri" w:eastAsia="Calibri" w:hAnsi="Calibri"/>
+                <w:b/>
+                <w:bCs/>
+                <w:color w:val="FFFFFF"/>
+                <w:sz w:val="19"/>
+                <w:szCs w:val="19"/>
+              </w:rPr>
+              <w:t xml:space="preserve">Operator</w:t>
+            </w:r>
+          </w:p>
+        </w:tc>
+        <w:tc>
+          <w:tcPr>
+            <w:tcW w:type="dxa" w:w="1250"/>
+            <w:shd w:fill="0F2A44" w:val="clear"/>
+            <w:tcMar>
+              <w:top w:type="dxa" w:w="70"/>
+              <w:left w:type="dxa" w:w="110"/>
+              <w:bottom w:type="dxa" w:w="70"/>
+              <w:right w:type="dxa" w:w="110"/>
+            </w:tcMar>
+          </w:tcPr>
+          <w:p>
+            <w:pPr>
+              <w:spacing w:after="0"/>
+            </w:pPr>
+            <w:r>
+              <w:rPr>
+                <w:rFonts w:ascii="Calibri" w:cs="Calibri" w:eastAsia="Calibri" w:hAnsi="Calibri"/>
+                <w:b/>
+                <w:bCs/>
+                <w:color w:val="FFFFFF"/>
+                <w:sz w:val="19"/>
+                <w:szCs w:val="19"/>
+              </w:rPr>
+              <w:t xml:space="preserve">Params</w:t>
+            </w:r>
+          </w:p>
+        </w:tc>
+        <w:tc>
+          <w:tcPr>
+            <w:tcW w:type="dxa" w:w="2400"/>
+            <w:shd w:fill="0F2A44" w:val="clear"/>
+            <w:tcMar>
+              <w:top w:type="dxa" w:w="70"/>
+              <w:left w:type="dxa" w:w="110"/>
+              <w:bottom w:type="dxa" w:w="70"/>
+              <w:right w:type="dxa" w:w="110"/>
+            </w:tcMar>
+          </w:tcPr>
+          <w:p>
+            <w:pPr>
+              <w:spacing w:after="0"/>
+            </w:pPr>
+            <w:r>
+              <w:rPr>
+                <w:rFonts w:ascii="Calibri" w:cs="Calibri" w:eastAsia="Calibri" w:hAnsi="Calibri"/>
+                <w:b/>
+                <w:bCs/>
+                <w:color w:val="FFFFFF"/>
+                <w:sz w:val="19"/>
+                <w:szCs w:val="19"/>
+              </w:rPr>
+              <w:t xml:space="preserve">Phép tính / ảnh</w:t>
+            </w:r>
+          </w:p>
+        </w:tc>
+        <w:tc>
+          <w:tcPr>
+            <w:tcW w:type="dxa" w:w="3876"/>
+            <w:shd w:fill="0F2A44" w:val="clear"/>
+            <w:tcMar>
+              <w:top w:type="dxa" w:w="70"/>
+              <w:left w:type="dxa" w:w="110"/>
+              <w:bottom w:type="dxa" w:w="70"/>
+              <w:right w:type="dxa" w:w="110"/>
+            </w:tcMar>
+          </w:tcPr>
+          <w:p>
+            <w:pPr>
+              <w:spacing w:after="0"/>
+            </w:pPr>
+            <w:r>
+              <w:rPr>
+                <w:rFonts w:ascii="Calibri" w:cs="Calibri" w:eastAsia="Calibri" w:hAnsi="Calibri"/>
+                <w:b/>
+                <w:bCs/>
+                <w:color w:val="FFFFFF"/>
+                <w:sz w:val="19"/>
+                <w:szCs w:val="19"/>
+              </w:rPr>
+              <w:t xml:space="preserve">Mức FPGA-friendly</w:t>
+            </w:r>
+          </w:p>
+        </w:tc>
+      </w:tr>
+      <w:tr>
+        <w:tc>
+          <w:tcPr>
+            <w:tcW w:type="dxa" w:w="1500"/>
+            <w:shd w:fill="F4F8FA" w:val="clear"/>
+            <w:tcMar>
+              <w:top w:type="dxa" w:w="70"/>
+              <w:left w:type="dxa" w:w="110"/>
+              <w:bottom w:type="dxa" w:w="70"/>
+              <w:right w:type="dxa" w:w="110"/>
+            </w:tcMar>
+          </w:tcPr>
+          <w:p>
+            <w:pPr>
+              <w:spacing w:after="0"/>
+            </w:pPr>
+            <w:r>
+              <w:rPr>
+                <w:rFonts w:ascii="Calibri" w:cs="Calibri" w:eastAsia="Calibri" w:hAnsi="Calibri"/>
+                <w:b/>
+                <w:bCs/>
+                <w:color w:val="1A2733"/>
+                <w:sz w:val="19"/>
+                <w:szCs w:val="19"/>
+              </w:rPr>
+              <w:t xml:space="preserve">Conv2d</w:t>
+            </w:r>
+          </w:p>
+        </w:tc>
+        <w:tc>
+          <w:tcPr>
+            <w:tcW w:type="dxa" w:w="1250"/>
+            <w:shd w:fill="F4F8FA" w:val="clear"/>
+            <w:tcMar>
+              <w:top w:type="dxa" w:w="70"/>
+              <w:left w:type="dxa" w:w="110"/>
+              <w:bottom w:type="dxa" w:w="70"/>
+              <w:right w:type="dxa" w:w="110"/>
+            </w:tcMar>
+          </w:tcPr>
+          <w:p>
+            <w:pPr>
+              <w:spacing w:after="0"/>
+            </w:pPr>
+            <w:r>
+              <w:rPr>
+                <w:rFonts w:ascii="Calibri" w:cs="Calibri" w:eastAsia="Calibri" w:hAnsi="Calibri"/>
+                <w:color w:val="1A2733"/>
+                <w:sz w:val="19"/>
+                <w:szCs w:val="19"/>
+              </w:rPr>
+              <w:t xml:space="preserve">3.568</w:t>
+            </w:r>
+          </w:p>
+        </w:tc>
+        <w:tc>
+          <w:tcPr>
+            <w:tcW w:type="dxa" w:w="2400"/>
+            <w:shd w:fill="F4F8FA" w:val="clear"/>
+            <w:tcMar>
+              <w:top w:type="dxa" w:w="70"/>
+              <w:left w:type="dxa" w:w="110"/>
+              <w:bottom w:type="dxa" w:w="70"/>
+              <w:right w:type="dxa" w:w="110"/>
+            </w:tcMar>
+          </w:tcPr>
+          <w:p>
+            <w:pPr>
+              <w:spacing w:after="0"/>
+            </w:pPr>
+            <w:r>
+              <w:rPr>
+                <w:rFonts w:ascii="Calibri" w:cs="Calibri" w:eastAsia="Calibri" w:hAnsi="Calibri"/>
+                <w:color w:val="1A2733"/>
+                <w:sz w:val="19"/>
+                <w:szCs w:val="19"/>
+              </w:rPr>
+              <w:t xml:space="preserve">395.136 MAC</w:t>
+            </w:r>
+          </w:p>
+        </w:tc>
+        <w:tc>
+          <w:tcPr>
+            <w:tcW w:type="dxa" w:w="3876"/>
+            <w:shd w:fill="F4F8FA" w:val="clear"/>
+            <w:tcMar>
+              <w:top w:type="dxa" w:w="70"/>
+              <w:left w:type="dxa" w:w="110"/>
+              <w:bottom w:type="dxa" w:w="70"/>
+              <w:right w:type="dxa" w:w="110"/>
+            </w:tcMar>
+          </w:tcPr>
+          <w:p>
+            <w:pPr>
+              <w:spacing w:after="0"/>
+            </w:pPr>
+            <w:r>
+              <w:rPr>
+                <w:rFonts w:ascii="Calibri" w:cs="Calibri" w:eastAsia="Calibri" w:hAnsi="Calibri"/>
+                <w:color w:val="1A2733"/>
+                <w:sz w:val="19"/>
+                <w:szCs w:val="19"/>
+              </w:rPr>
+              <w:t xml:space="preserve">Rất tốt — chỉ nhân và cộng, dùng lại trọng số nhiều lần</w:t>
+            </w:r>
+          </w:p>
+        </w:tc>
+      </w:tr>
+      <w:tr>
+        <w:tc>
+          <w:tcPr>
+            <w:tcW w:type="dxa" w:w="1500"/>
+            <w:shd w:fill="F4F8FA" w:val="clear"/>
+            <w:tcMar>
+              <w:top w:type="dxa" w:w="70"/>
+              <w:left w:type="dxa" w:w="110"/>
+              <w:bottom w:type="dxa" w:w="70"/>
+              <w:right w:type="dxa" w:w="110"/>
+            </w:tcMar>
+          </w:tcPr>
+          <w:p>
+            <w:pPr>
+              <w:spacing w:after="0"/>
+            </w:pPr>
+            <w:r>
+              <w:rPr>
+                <w:rFonts w:ascii="Calibri" w:cs="Calibri" w:eastAsia="Calibri" w:hAnsi="Calibri"/>
+                <w:b/>
+                <w:bCs/>
+                <w:color w:val="1A2733"/>
+                <w:sz w:val="19"/>
+                <w:szCs w:val="19"/>
+              </w:rPr>
+              <w:t xml:space="preserve">ReLU</w:t>
+            </w:r>
+          </w:p>
+        </w:tc>
+        <w:tc>
+          <w:tcPr>
+            <w:tcW w:type="dxa" w:w="1250"/>
+            <w:shd w:fill="F4F8FA" w:val="clear"/>
+            <w:tcMar>
+              <w:top w:type="dxa" w:w="70"/>
+              <w:left w:type="dxa" w:w="110"/>
+              <w:bottom w:type="dxa" w:w="70"/>
+              <w:right w:type="dxa" w:w="110"/>
+            </w:tcMar>
+          </w:tcPr>
+          <w:p>
+            <w:pPr>
+              <w:spacing w:after="0"/>
+            </w:pPr>
+            <w:r>
+              <w:rPr>
+                <w:rFonts w:ascii="Calibri" w:cs="Calibri" w:eastAsia="Calibri" w:hAnsi="Calibri"/>
+                <w:color w:val="1A2733"/>
+                <w:sz w:val="19"/>
+                <w:szCs w:val="19"/>
+              </w:rPr>
+              <w:t xml:space="preserve">0</w:t>
+            </w:r>
+          </w:p>
+        </w:tc>
+        <w:tc>
+          <w:tcPr>
+            <w:tcW w:type="dxa" w:w="2400"/>
+            <w:shd w:fill="F4F8FA" w:val="clear"/>
+            <w:tcMar>
+              <w:top w:type="dxa" w:w="70"/>
+              <w:left w:type="dxa" w:w="110"/>
+              <w:bottom w:type="dxa" w:w="70"/>
+              <w:right w:type="dxa" w:w="110"/>
+            </w:tcMar>
+          </w:tcPr>
+          <w:p>
+            <w:pPr>
+              <w:spacing w:after="0"/>
+            </w:pPr>
+            <w:r>
+              <w:rPr>
+                <w:rFonts w:ascii="Calibri" w:cs="Calibri" w:eastAsia="Calibri" w:hAnsi="Calibri"/>
+                <w:color w:val="1A2733"/>
+                <w:sz w:val="19"/>
+                <w:szCs w:val="19"/>
+              </w:rPr>
+              <w:t xml:space="preserve">10.192 so sánh</w:t>
+            </w:r>
+          </w:p>
+        </w:tc>
+        <w:tc>
+          <w:tcPr>
+            <w:tcW w:type="dxa" w:w="3876"/>
+            <w:shd w:fill="F4F8FA" w:val="clear"/>
+            <w:tcMar>
+              <w:top w:type="dxa" w:w="70"/>
+              <w:left w:type="dxa" w:w="110"/>
+              <w:bottom w:type="dxa" w:w="70"/>
+              <w:right w:type="dxa" w:w="110"/>
+            </w:tcMar>
+          </w:tcPr>
+          <w:p>
+            <w:pPr>
+              <w:spacing w:after="0"/>
+            </w:pPr>
+            <w:r>
+              <w:rPr>
+                <w:rFonts w:ascii="Calibri" w:cs="Calibri" w:eastAsia="Calibri" w:hAnsi="Calibri"/>
+                <w:color w:val="1A2733"/>
+                <w:sz w:val="19"/>
+                <w:szCs w:val="19"/>
+              </w:rPr>
+              <w:t xml:space="preserve">Tốt nhất — một phép so sánh với 0, không cần nhân</w:t>
+            </w:r>
+          </w:p>
+        </w:tc>
+      </w:tr>
+      <w:tr>
+        <w:tc>
+          <w:tcPr>
+            <w:tcW w:type="dxa" w:w="1500"/>
+            <w:shd w:fill="F4F8FA" w:val="clear"/>
+            <w:tcMar>
+              <w:top w:type="dxa" w:w="70"/>
+              <w:left w:type="dxa" w:w="110"/>
+              <w:bottom w:type="dxa" w:w="70"/>
+              <w:right w:type="dxa" w:w="110"/>
+            </w:tcMar>
+          </w:tcPr>
+          <w:p>
+            <w:pPr>
+              <w:spacing w:after="0"/>
+            </w:pPr>
+            <w:r>
+              <w:rPr>
+                <w:rFonts w:ascii="Calibri" w:cs="Calibri" w:eastAsia="Calibri" w:hAnsi="Calibri"/>
+                <w:b/>
+                <w:bCs/>
+                <w:color w:val="1A2733"/>
+                <w:sz w:val="19"/>
+                <w:szCs w:val="19"/>
+              </w:rPr>
+              <w:t xml:space="preserve">MaxPool2d</w:t>
+            </w:r>
+          </w:p>
+        </w:tc>
+        <w:tc>
+          <w:tcPr>
+            <w:tcW w:type="dxa" w:w="1250"/>
+            <w:shd w:fill="F4F8FA" w:val="clear"/>
+            <w:tcMar>
+              <w:top w:type="dxa" w:w="70"/>
+              <w:left w:type="dxa" w:w="110"/>
+              <w:bottom w:type="dxa" w:w="70"/>
+              <w:right w:type="dxa" w:w="110"/>
+            </w:tcMar>
+          </w:tcPr>
+          <w:p>
+            <w:pPr>
+              <w:spacing w:after="0"/>
+            </w:pPr>
+            <w:r>
+              <w:rPr>
+                <w:rFonts w:ascii="Calibri" w:cs="Calibri" w:eastAsia="Calibri" w:hAnsi="Calibri"/>
+                <w:color w:val="1A2733"/>
+                <w:sz w:val="19"/>
+                <w:szCs w:val="19"/>
+              </w:rPr>
+              <w:t xml:space="preserve">0</w:t>
+            </w:r>
+          </w:p>
+        </w:tc>
+        <w:tc>
+          <w:tcPr>
+            <w:tcW w:type="dxa" w:w="2400"/>
+            <w:shd w:fill="F4F8FA" w:val="clear"/>
+            <w:tcMar>
+              <w:top w:type="dxa" w:w="70"/>
+              <w:left w:type="dxa" w:w="110"/>
+              <w:bottom w:type="dxa" w:w="70"/>
+              <w:right w:type="dxa" w:w="110"/>
+            </w:tcMar>
+          </w:tcPr>
+          <w:p>
+            <w:pPr>
+              <w:spacing w:after="0"/>
+            </w:pPr>
+            <w:r>
+              <w:rPr>
+                <w:rFonts w:ascii="Calibri" w:cs="Calibri" w:eastAsia="Calibri" w:hAnsi="Calibri"/>
+                <w:color w:val="1A2733"/>
+                <w:sz w:val="19"/>
+                <w:szCs w:val="19"/>
+              </w:rPr>
+              <w:t xml:space="preserve">7.488 so sánh</w:t>
+            </w:r>
+          </w:p>
+        </w:tc>
+        <w:tc>
+          <w:tcPr>
+            <w:tcW w:type="dxa" w:w="3876"/>
+            <w:shd w:fill="F4F8FA" w:val="clear"/>
+            <w:tcMar>
+              <w:top w:type="dxa" w:w="70"/>
+              <w:left w:type="dxa" w:w="110"/>
+              <w:bottom w:type="dxa" w:w="70"/>
+              <w:right w:type="dxa" w:w="110"/>
+            </w:tcMar>
+          </w:tcPr>
+          <w:p>
+            <w:pPr>
+              <w:spacing w:after="0"/>
+            </w:pPr>
+            <w:r>
+              <w:rPr>
+                <w:rFonts w:ascii="Calibri" w:cs="Calibri" w:eastAsia="Calibri" w:hAnsi="Calibri"/>
+                <w:color w:val="1A2733"/>
+                <w:sz w:val="19"/>
+                <w:szCs w:val="19"/>
+              </w:rPr>
+              <w:t xml:space="preserve">Rất tốt — không có phép nhân nào</w:t>
+            </w:r>
+          </w:p>
+        </w:tc>
+      </w:tr>
+      <w:tr>
+        <w:tc>
+          <w:tcPr>
+            <w:tcW w:type="dxa" w:w="1500"/>
+            <w:shd w:fill="F4F8FA" w:val="clear"/>
+            <w:tcMar>
+              <w:top w:type="dxa" w:w="70"/>
+              <w:left w:type="dxa" w:w="110"/>
+              <w:bottom w:type="dxa" w:w="70"/>
+              <w:right w:type="dxa" w:w="110"/>
+            </w:tcMar>
+          </w:tcPr>
+          <w:p>
+            <w:pPr>
+              <w:spacing w:after="0"/>
+            </w:pPr>
+            <w:r>
+              <w:rPr>
+                <w:rFonts w:ascii="Calibri" w:cs="Calibri" w:eastAsia="Calibri" w:hAnsi="Calibri"/>
+                <w:b/>
+                <w:bCs/>
+                <w:color w:val="1A2733"/>
+                <w:sz w:val="19"/>
+                <w:szCs w:val="19"/>
+              </w:rPr>
+              <w:t xml:space="preserve">Flatten</w:t>
+            </w:r>
+          </w:p>
+        </w:tc>
+        <w:tc>
+          <w:tcPr>
+            <w:tcW w:type="dxa" w:w="1250"/>
+            <w:shd w:fill="F4F8FA" w:val="clear"/>
+            <w:tcMar>
+              <w:top w:type="dxa" w:w="70"/>
+              <w:left w:type="dxa" w:w="110"/>
+              <w:bottom w:type="dxa" w:w="70"/>
+              <w:right w:type="dxa" w:w="110"/>
+            </w:tcMar>
+          </w:tcPr>
+          <w:p>
+            <w:pPr>
+              <w:spacing w:after="0"/>
+            </w:pPr>
+            <w:r>
+              <w:rPr>
+                <w:rFonts w:ascii="Calibri" w:cs="Calibri" w:eastAsia="Calibri" w:hAnsi="Calibri"/>
+                <w:color w:val="1A2733"/>
+                <w:sz w:val="19"/>
+                <w:szCs w:val="19"/>
+              </w:rPr>
+              <w:t xml:space="preserve">0</w:t>
+            </w:r>
+          </w:p>
+        </w:tc>
+        <w:tc>
+          <w:tcPr>
+            <w:tcW w:type="dxa" w:w="2400"/>
+            <w:shd w:fill="F4F8FA" w:val="clear"/>
+            <w:tcMar>
+              <w:top w:type="dxa" w:w="70"/>
+              <w:left w:type="dxa" w:w="110"/>
+              <w:bottom w:type="dxa" w:w="70"/>
+              <w:right w:type="dxa" w:w="110"/>
+            </w:tcMar>
+          </w:tcPr>
+          <w:p>
+            <w:pPr>
+              <w:spacing w:after="0"/>
+            </w:pPr>
+            <w:r>
+              <w:rPr>
+                <w:rFonts w:ascii="Calibri" w:cs="Calibri" w:eastAsia="Calibri" w:hAnsi="Calibri"/>
+                <w:color w:val="1A2733"/>
+                <w:sz w:val="19"/>
+                <w:szCs w:val="19"/>
+              </w:rPr>
+              <w:t xml:space="preserve">0</w:t>
+            </w:r>
+          </w:p>
+        </w:tc>
+        <w:tc>
+          <w:tcPr>
+            <w:tcW w:type="dxa" w:w="3876"/>
+            <w:shd w:fill="F4F8FA" w:val="clear"/>
+            <w:tcMar>
+              <w:top w:type="dxa" w:w="70"/>
+              <w:left w:type="dxa" w:w="110"/>
+              <w:bottom w:type="dxa" w:w="70"/>
+              <w:right w:type="dxa" w:w="110"/>
+            </w:tcMar>
+          </w:tcPr>
+          <w:p>
+            <w:pPr>
+              <w:spacing w:after="0"/>
+            </w:pPr>
+            <w:r>
+              <w:rPr>
+                <w:rFonts w:ascii="Calibri" w:cs="Calibri" w:eastAsia="Calibri" w:hAnsi="Calibri"/>
+                <w:color w:val="1A2733"/>
+                <w:sz w:val="19"/>
+                <w:szCs w:val="19"/>
+              </w:rPr>
+              <w:t xml:space="preserve">Miễn phí — chỉ là cách đánh chỉ số lại cùng vùng nhớ</w:t>
+            </w:r>
+          </w:p>
+        </w:tc>
+      </w:tr>
+      <w:tr>
+        <w:tc>
+          <w:tcPr>
+            <w:tcW w:type="dxa" w:w="1500"/>
+            <w:shd w:fill="F4F8FA" w:val="clear"/>
+            <w:tcMar>
+              <w:top w:type="dxa" w:w="70"/>
+              <w:left w:type="dxa" w:w="110"/>
+              <w:bottom w:type="dxa" w:w="70"/>
+              <w:right w:type="dxa" w:w="110"/>
+            </w:tcMar>
+          </w:tcPr>
+          <w:p>
+            <w:pPr>
+              <w:spacing w:after="0"/>
+            </w:pPr>
+            <w:r>
+              <w:rPr>
+                <w:rFonts w:ascii="Calibri" w:cs="Calibri" w:eastAsia="Calibri" w:hAnsi="Calibri"/>
+                <w:b/>
+                <w:bCs/>
+                <w:color w:val="1A2733"/>
+                <w:sz w:val="19"/>
+                <w:szCs w:val="19"/>
+              </w:rPr>
+              <w:t xml:space="preserve">Linear</w:t>
+            </w:r>
+          </w:p>
+        </w:tc>
+        <w:tc>
+          <w:tcPr>
+            <w:tcW w:type="dxa" w:w="1250"/>
+            <w:shd w:fill="F4F8FA" w:val="clear"/>
+            <w:tcMar>
+              <w:top w:type="dxa" w:w="70"/>
+              <w:left w:type="dxa" w:w="110"/>
+              <w:bottom w:type="dxa" w:w="70"/>
+              <w:right w:type="dxa" w:w="110"/>
+            </w:tcMar>
+          </w:tcPr>
+          <w:p>
+            <w:pPr>
+              <w:spacing w:after="0"/>
+            </w:pPr>
+            <w:r>
+              <w:rPr>
+                <w:rFonts w:ascii="Calibri" w:cs="Calibri" w:eastAsia="Calibri" w:hAnsi="Calibri"/>
+                <w:color w:val="1A2733"/>
+                <w:sz w:val="19"/>
+                <w:szCs w:val="19"/>
+              </w:rPr>
+              <w:t xml:space="preserve">1.450</w:t>
+            </w:r>
+          </w:p>
+        </w:tc>
+        <w:tc>
+          <w:tcPr>
+            <w:tcW w:type="dxa" w:w="2400"/>
+            <w:shd w:fill="F4F8FA" w:val="clear"/>
+            <w:tcMar>
+              <w:top w:type="dxa" w:w="70"/>
+              <w:left w:type="dxa" w:w="110"/>
+              <w:bottom w:type="dxa" w:w="70"/>
+              <w:right w:type="dxa" w:w="110"/>
+            </w:tcMar>
+          </w:tcPr>
+          <w:p>
+            <w:pPr>
+              <w:spacing w:after="0"/>
+            </w:pPr>
+            <w:r>
+              <w:rPr>
+                <w:rFonts w:ascii="Calibri" w:cs="Calibri" w:eastAsia="Calibri" w:hAnsi="Calibri"/>
+                <w:color w:val="1A2733"/>
+                <w:sz w:val="19"/>
+                <w:szCs w:val="19"/>
+              </w:rPr>
+              <w:t xml:space="preserve">1.440 MAC</w:t>
+            </w:r>
+          </w:p>
+        </w:tc>
+        <w:tc>
+          <w:tcPr>
+            <w:tcW w:type="dxa" w:w="3876"/>
+            <w:shd w:fill="F4F8FA" w:val="clear"/>
+            <w:tcMar>
+              <w:top w:type="dxa" w:w="70"/>
+              <w:left w:type="dxa" w:w="110"/>
+              <w:bottom w:type="dxa" w:w="70"/>
+              <w:right w:type="dxa" w:w="110"/>
+            </w:tcMar>
+          </w:tcPr>
+          <w:p>
+            <w:pPr>
+              <w:spacing w:after="0"/>
+            </w:pPr>
+            <w:r>
+              <w:rPr>
+                <w:rFonts w:ascii="Calibri" w:cs="Calibri" w:eastAsia="Calibri" w:hAnsi="Calibri"/>
+                <w:color w:val="1A2733"/>
+                <w:sz w:val="19"/>
+                <w:szCs w:val="19"/>
+              </w:rPr>
+              <w:t xml:space="preserve">Nghẽn băng thông — mỗi trọng số dùng đúng 1 lần</w:t>
+            </w:r>
+          </w:p>
+        </w:tc>
+      </w:tr>
+      <w:tr>
+        <w:tc>
+          <w:tcPr>
+            <w:tcW w:type="dxa" w:w="1500"/>
+            <w:shd w:fill="F4F8FA" w:val="clear"/>
+            <w:tcMar>
+              <w:top w:type="dxa" w:w="70"/>
+              <w:left w:type="dxa" w:w="110"/>
+              <w:bottom w:type="dxa" w:w="70"/>
+              <w:right w:type="dxa" w:w="110"/>
+            </w:tcMar>
+          </w:tcPr>
+          <w:p>
+            <w:pPr>
+              <w:spacing w:after="0"/>
+            </w:pPr>
+            <w:r>
+              <w:rPr>
+                <w:rFonts w:ascii="Calibri" w:cs="Calibri" w:eastAsia="Calibri" w:hAnsi="Calibri"/>
+                <w:b/>
+                <w:bCs/>
+                <w:color w:val="1A2733"/>
+                <w:sz w:val="19"/>
+                <w:szCs w:val="19"/>
+              </w:rPr>
+              <w:t xml:space="preserve">argmax</w:t>
+            </w:r>
+          </w:p>
+        </w:tc>
+        <w:tc>
+          <w:tcPr>
+            <w:tcW w:type="dxa" w:w="1250"/>
+            <w:shd w:fill="F4F8FA" w:val="clear"/>
+            <w:tcMar>
+              <w:top w:type="dxa" w:w="70"/>
+              <w:left w:type="dxa" w:w="110"/>
+              <w:bottom w:type="dxa" w:w="70"/>
+              <w:right w:type="dxa" w:w="110"/>
+            </w:tcMar>
+          </w:tcPr>
+          <w:p>
+            <w:pPr>
+              <w:spacing w:after="0"/>
+            </w:pPr>
+            <w:r>
+              <w:rPr>
+                <w:rFonts w:ascii="Calibri" w:cs="Calibri" w:eastAsia="Calibri" w:hAnsi="Calibri"/>
+                <w:color w:val="1A2733"/>
+                <w:sz w:val="19"/>
+                <w:szCs w:val="19"/>
+              </w:rPr>
+              <w:t xml:space="preserve">0</w:t>
+            </w:r>
+          </w:p>
+        </w:tc>
+        <w:tc>
+          <w:tcPr>
+            <w:tcW w:type="dxa" w:w="2400"/>
+            <w:shd w:fill="F4F8FA" w:val="clear"/>
+            <w:tcMar>
+              <w:top w:type="dxa" w:w="70"/>
+              <w:left w:type="dxa" w:w="110"/>
+              <w:bottom w:type="dxa" w:w="70"/>
+              <w:right w:type="dxa" w:w="110"/>
+            </w:tcMar>
+          </w:tcPr>
+          <w:p>
+            <w:pPr>
+              <w:spacing w:after="0"/>
+            </w:pPr>
+            <w:r>
+              <w:rPr>
+                <w:rFonts w:ascii="Calibri" w:cs="Calibri" w:eastAsia="Calibri" w:hAnsi="Calibri"/>
+                <w:color w:val="1A2733"/>
+                <w:sz w:val="19"/>
+                <w:szCs w:val="19"/>
+              </w:rPr>
+              <w:t xml:space="preserve">9 so sánh</w:t>
+            </w:r>
+          </w:p>
+        </w:tc>
+        <w:tc>
+          <w:tcPr>
+            <w:tcW w:type="dxa" w:w="3876"/>
+            <w:shd w:fill="F4F8FA" w:val="clear"/>
+            <w:tcMar>
+              <w:top w:type="dxa" w:w="70"/>
+              <w:left w:type="dxa" w:w="110"/>
+              <w:bottom w:type="dxa" w:w="70"/>
+              <w:right w:type="dxa" w:w="110"/>
+            </w:tcMar>
+          </w:tcPr>
+          <w:p>
+            <w:pPr>
+              <w:spacing w:after="0"/>
+            </w:pPr>
+            <w:r>
+              <w:rPr>
+                <w:rFonts w:ascii="Calibri" w:cs="Calibri" w:eastAsia="Calibri" w:hAnsi="Calibri"/>
+                <w:color w:val="1A2733"/>
+                <w:sz w:val="19"/>
+                <w:szCs w:val="19"/>
+              </w:rPr>
+              <w:t xml:space="preserve">Gần như miễn phí</w:t>
+            </w:r>
+          </w:p>
+        </w:tc>
+      </w:tr>
+      <w:tr>
+        <w:tc>
+          <w:tcPr>
+            <w:tcW w:type="dxa" w:w="1500"/>
+            <w:shd w:fill="F4F8FA" w:val="clear"/>
+            <w:tcMar>
+              <w:top w:type="dxa" w:w="70"/>
+              <w:left w:type="dxa" w:w="110"/>
+              <w:bottom w:type="dxa" w:w="70"/>
+              <w:right w:type="dxa" w:w="110"/>
+            </w:tcMar>
+          </w:tcPr>
+          <w:p>
+            <w:pPr>
+              <w:spacing w:after="0"/>
+            </w:pPr>
+            <w:r>
+              <w:rPr>
+                <w:rFonts w:ascii="Calibri" w:cs="Calibri" w:eastAsia="Calibri" w:hAnsi="Calibri"/>
+                <w:b/>
+                <w:bCs/>
+                <w:color w:val="1A2733"/>
+                <w:sz w:val="19"/>
+                <w:szCs w:val="19"/>
+              </w:rPr>
+              <w:t xml:space="preserve">Tổng</w:t>
+            </w:r>
+          </w:p>
+        </w:tc>
+        <w:tc>
+          <w:tcPr>
+            <w:tcW w:type="dxa" w:w="1250"/>
+            <w:shd w:fill="F4F8FA" w:val="clear"/>
+            <w:tcMar>
+              <w:top w:type="dxa" w:w="70"/>
+              <w:left w:type="dxa" w:w="110"/>
+              <w:bottom w:type="dxa" w:w="70"/>
+              <w:right w:type="dxa" w:w="110"/>
+            </w:tcMar>
+          </w:tcPr>
+          <w:p>
+            <w:pPr>
+              <w:spacing w:after="0"/>
+            </w:pPr>
+            <w:r>
+              <w:rPr>
+                <w:rFonts w:ascii="Calibri" w:cs="Calibri" w:eastAsia="Calibri" w:hAnsi="Calibri"/>
+                <w:color w:val="1A2733"/>
+                <w:sz w:val="19"/>
+                <w:szCs w:val="19"/>
+              </w:rPr>
+              <w:t xml:space="preserve">5.018</w:t>
+            </w:r>
+          </w:p>
+        </w:tc>
+        <w:tc>
+          <w:tcPr>
+            <w:tcW w:type="dxa" w:w="2400"/>
+            <w:shd w:fill="F4F8FA" w:val="clear"/>
+            <w:tcMar>
+              <w:top w:type="dxa" w:w="70"/>
+              <w:left w:type="dxa" w:w="110"/>
+              <w:bottom w:type="dxa" w:w="70"/>
+              <w:right w:type="dxa" w:w="110"/>
+            </w:tcMar>
+          </w:tcPr>
+          <w:p>
+            <w:pPr>
+              <w:spacing w:after="0"/>
+            </w:pPr>
+            <w:r>
+              <w:rPr>
+                <w:rFonts w:ascii="Calibri" w:cs="Calibri" w:eastAsia="Calibri" w:hAnsi="Calibri"/>
+                <w:color w:val="1A2733"/>
+                <w:sz w:val="19"/>
+                <w:szCs w:val="19"/>
+              </w:rPr>
+              <w:t xml:space="preserve">414.265</w:t>
+            </w:r>
+          </w:p>
+        </w:tc>
+        <w:tc>
+          <w:tcPr>
+            <w:tcW w:type="dxa" w:w="3876"/>
+            <w:shd w:fill="F4F8FA" w:val="clear"/>
+            <w:tcMar>
+              <w:top w:type="dxa" w:w="70"/>
+              <w:left w:type="dxa" w:w="110"/>
+              <w:bottom w:type="dxa" w:w="70"/>
+              <w:right w:type="dxa" w:w="110"/>
+            </w:tcMar>
+          </w:tcPr>
+          <w:p>
+            <w:pPr>
+              <w:spacing w:after="0"/>
+            </w:pPr>
+            <w:r>
+              <w:rPr>
+                <w:rFonts w:ascii="Calibri" w:cs="Calibri" w:eastAsia="Calibri" w:hAnsi="Calibri"/>
+                <w:color w:val="1A2733"/>
+                <w:sz w:val="19"/>
+                <w:szCs w:val="19"/>
+              </w:rPr>
+              <w:t xml:space="preserve">—</w:t>
+            </w:r>
+          </w:p>
+        </w:tc>
+      </w:tr>
+    </w:tbl>
+    <w:p>
+      <w:pPr>
+        <w:spacing w:after="120"/>
+      </w:pPr>
+    </w:p>
+    <w:p>
+      <w:pPr>
+        <w:pBdr>
+          <w:left w:val="single" w:color="1C7293" w:sz="12" w:space="8"/>
+        </w:pBdr>
+        <w:shd w:fill="F7FAFB" w:val="clear"/>
+        <w:spacing w:after="180" w:before="100"/>
+        <w:ind w:left="160" w:right="160"/>
+      </w:pPr>
+      <w:r>
+        <w:rPr>
+          <w:rFonts w:ascii="Calibri" w:cs="Calibri" w:eastAsia="Calibri" w:hAnsi="Calibri"/>
+          <w:i/>
+          <w:iCs/>
+          <w:color w:val="5F7183"/>
+          <w:sz w:val="21"/>
+          <w:szCs w:val="21"/>
+        </w:rPr>
+        <w:t xml:space="preserve">Params và khối lượng tính toán là hai trục khác nhau. Ba lớp conv chiếm 95% khối lượng tính toán nhưng chỉ 71% tham số. Lớp fc ngược lại: 0,3% tính toán nhưng 29% tham số. Hệ quả thực tế: thêm bộ nhân cho fc là vô ích, vì fc chờ dữ liệu từ bộ nhớ chứ không chờ phép nhân — conv2 dùng lại mỗi trọng số 196 lần, fc dùng đúng 1 lần.</w:t>
+      </w:r>
+    </w:p>
+    <w:p>
+      <w:pPr>
+        <w:pStyle w:val="Heading2"/>
+      </w:pPr>
+      <w:r>
+        <w:t xml:space="preserve">5.2 Mã giả — viết được thành C ngay</w:t>
+      </w:r>
+    </w:p>
+    <w:p>
+      <w:pPr>
+        <w:spacing w:after="120" w:before="0"/>
+      </w:pPr>
+      <w:r>
+        <w:rPr>
+          <w:rFonts w:ascii="Calibri" w:cs="Calibri" w:eastAsia="Calibri" w:hAnsi="Calibri"/>
+          <w:color w:val="1A2733"/>
+          <w:sz w:val="22"/>
+          <w:szCs w:val="22"/>
+        </w:rPr>
+        <w:t xml:space="preserve">Mã giả dưới đây không phụ thuộc thư viện nào, đổi sang C là việc gõ lại cú pháp. Bản đầy đủ của từng operator, kèm công thức và cách suy ra, nằm trong thư mục operators/ của project.</w:t>
+      </w:r>
+    </w:p>
+    <w:p>
+      <w:pPr>
+        <w:spacing w:after="120" w:before="0"/>
+      </w:pPr>
+      <w:r>
+        <w:rPr>
+          <w:rFonts w:ascii="Calibri" w:cs="Calibri" w:eastAsia="Calibri" w:hAnsi="Calibri"/>
+          <w:b/>
+          <w:bCs/>
+          <w:color w:val="1A2733"/>
+          <w:sz w:val="22"/>
+          <w:szCs w:val="22"/>
+        </w:rPr>
+        <w:t xml:space="preserve">Conv2d — sáu vòng lặp lồng nhau:</w:t>
+      </w:r>
+    </w:p>
+    <w:p>
+      <w:pPr>
+        <w:shd w:fill="F2F6F8" w:val="clear"/>
+        <w:spacing w:after="0" w:before="100"/>
+        <w:ind w:left="200" w:right="200"/>
+      </w:pPr>
+      <w:r>
+        <w:rPr>
+          <w:rFonts w:ascii="Courier New" w:cs="Courier New" w:eastAsia="Courier New" w:hAnsi="Courier New"/>
+          <w:color w:val="0F2A44"/>
+          <w:sz w:val="19"/>
+          <w:szCs w:val="19"/>
+        </w:rPr>
+        <w:t xml:space="preserve">for oc in 0..OC-1:</w:t>
+      </w:r>
+    </w:p>
+    <w:p>
+      <w:pPr>
+        <w:shd w:fill="F2F6F8" w:val="clear"/>
+        <w:spacing w:after="0" w:before="0"/>
+        <w:ind w:left="200" w:right="200"/>
+      </w:pPr>
+      <w:r>
+        <w:rPr>
+          <w:rFonts w:ascii="Courier New" w:cs="Courier New" w:eastAsia="Courier New" w:hAnsi="Courier New"/>
+          <w:color w:val="0F2A44"/>
+          <w:sz w:val="19"/>
+          <w:szCs w:val="19"/>
+        </w:rPr>
+        <w:t xml:space="preserve">  for oh in 0..OH-1:</w:t>
+      </w:r>
+    </w:p>
+    <w:p>
+      <w:pPr>
+        <w:shd w:fill="F2F6F8" w:val="clear"/>
+        <w:spacing w:after="0" w:before="0"/>
+        <w:ind w:left="200" w:right="200"/>
+      </w:pPr>
+      <w:r>
+        <w:rPr>
+          <w:rFonts w:ascii="Courier New" w:cs="Courier New" w:eastAsia="Courier New" w:hAnsi="Courier New"/>
+          <w:color w:val="0F2A44"/>
+          <w:sz w:val="19"/>
+          <w:szCs w:val="19"/>
+        </w:rPr>
+        <w:t xml:space="preserve">    for ow in 0..OW-1:</w:t>
+      </w:r>
+    </w:p>
+    <w:p>
+      <w:pPr>
+        <w:shd w:fill="F2F6F8" w:val="clear"/>
+        <w:spacing w:after="0" w:before="0"/>
+        <w:ind w:left="200" w:right="200"/>
+      </w:pPr>
+      <w:r>
+        <w:rPr>
+          <w:rFonts w:ascii="Courier New" w:cs="Courier New" w:eastAsia="Courier New" w:hAnsi="Courier New"/>
+          <w:color w:val="0F2A44"/>
+          <w:sz w:val="19"/>
+          <w:szCs w:val="19"/>
+        </w:rPr>
+        <w:t xml:space="preserve">      acc = bias[oc]                 // khởi tạo bằng BIAS, không phải 0</w:t>
+      </w:r>
+    </w:p>
+    <w:p>
+      <w:pPr>
+        <w:shd w:fill="F2F6F8" w:val="clear"/>
+        <w:spacing w:after="0" w:before="0"/>
+        <w:ind w:left="200" w:right="200"/>
+      </w:pPr>
+      <w:r>
+        <w:rPr>
+          <w:rFonts w:ascii="Courier New" w:cs="Courier New" w:eastAsia="Courier New" w:hAnsi="Courier New"/>
+          <w:color w:val="0F2A44"/>
+          <w:sz w:val="19"/>
+          <w:szCs w:val="19"/>
+        </w:rPr>
+        <w:t xml:space="preserve">      for ic in 0..IC-1:</w:t>
+      </w:r>
+    </w:p>
+    <w:p>
+      <w:pPr>
+        <w:shd w:fill="F2F6F8" w:val="clear"/>
+        <w:spacing w:after="0" w:before="0"/>
+        <w:ind w:left="200" w:right="200"/>
+      </w:pPr>
+      <w:r>
+        <w:rPr>
+          <w:rFonts w:ascii="Courier New" w:cs="Courier New" w:eastAsia="Courier New" w:hAnsi="Courier New"/>
+          <w:color w:val="0F2A44"/>
+          <w:sz w:val="19"/>
+          <w:szCs w:val="19"/>
+        </w:rPr>
+        <w:t xml:space="preserve">        for kh in 0..K-1:</w:t>
+      </w:r>
+    </w:p>
+    <w:p>
+      <w:pPr>
+        <w:shd w:fill="F2F6F8" w:val="clear"/>
+        <w:spacing w:after="0" w:before="0"/>
+        <w:ind w:left="200" w:right="200"/>
+      </w:pPr>
+      <w:r>
+        <w:rPr>
+          <w:rFonts w:ascii="Courier New" w:cs="Courier New" w:eastAsia="Courier New" w:hAnsi="Courier New"/>
+          <w:color w:val="0F2A44"/>
+          <w:sz w:val="19"/>
+          <w:szCs w:val="19"/>
+        </w:rPr>
+        <w:t xml:space="preserve">          for kw in 0..K-1:</w:t>
+      </w:r>
+    </w:p>
+    <w:p>
+      <w:pPr>
+        <w:shd w:fill="F2F6F8" w:val="clear"/>
+        <w:spacing w:after="0" w:before="0"/>
+        <w:ind w:left="200" w:right="200"/>
+      </w:pPr>
+      <w:r>
+        <w:rPr>
+          <w:rFonts w:ascii="Courier New" w:cs="Courier New" w:eastAsia="Courier New" w:hAnsi="Courier New"/>
+          <w:color w:val="0F2A44"/>
+          <w:sz w:val="19"/>
+          <w:szCs w:val="19"/>
+        </w:rPr>
+        <w:t xml:space="preserve">            ih = oh*stride - pad + kh</w:t>
+      </w:r>
+    </w:p>
+    <w:p>
+      <w:pPr>
+        <w:shd w:fill="F2F6F8" w:val="clear"/>
+        <w:spacing w:after="0" w:before="0"/>
+        <w:ind w:left="200" w:right="200"/>
+      </w:pPr>
+      <w:r>
+        <w:rPr>
+          <w:rFonts w:ascii="Courier New" w:cs="Courier New" w:eastAsia="Courier New" w:hAnsi="Courier New"/>
+          <w:color w:val="0F2A44"/>
+          <w:sz w:val="19"/>
+          <w:szCs w:val="19"/>
+        </w:rPr>
+        <w:t xml:space="preserve">            iw = ow*stride - pad + kw</w:t>
+      </w:r>
+    </w:p>
+    <w:p>
+      <w:pPr>
+        <w:shd w:fill="F2F6F8" w:val="clear"/>
+        <w:spacing w:after="0" w:before="0"/>
+        <w:ind w:left="200" w:right="200"/>
+      </w:pPr>
+      <w:r>
+        <w:rPr>
+          <w:rFonts w:ascii="Courier New" w:cs="Courier New" w:eastAsia="Courier New" w:hAnsi="Courier New"/>
+          <w:color w:val="0F2A44"/>
+          <w:sz w:val="19"/>
+          <w:szCs w:val="19"/>
+        </w:rPr>
+        <w:t xml:space="preserve">            if 0 &lt;= ih &lt; IH and 0 &lt;= iw &lt; IW:   // ngoài biên coi như 0</w:t>
+      </w:r>
+    </w:p>
+    <w:p>
+      <w:pPr>
+        <w:shd w:fill="F2F6F8" w:val="clear"/>
+        <w:spacing w:after="0" w:before="0"/>
+        <w:ind w:left="200" w:right="200"/>
+      </w:pPr>
+      <w:r>
+        <w:rPr>
+          <w:rFonts w:ascii="Courier New" w:cs="Courier New" w:eastAsia="Courier New" w:hAnsi="Courier New"/>
+          <w:color w:val="0F2A44"/>
+          <w:sz w:val="19"/>
+          <w:szCs w:val="19"/>
+        </w:rPr>
+        <w:t xml:space="preserve">              acc += in[ic][ih][iw] * w[oc][ic][kh][kw]</w:t>
+      </w:r>
+    </w:p>
+    <w:p>
+      <w:pPr>
+        <w:shd w:fill="F2F6F8" w:val="clear"/>
+        <w:spacing w:after="160" w:before="0"/>
+        <w:ind w:left="200" w:right="200"/>
+      </w:pPr>
+      <w:r>
+        <w:rPr>
+          <w:rFonts w:ascii="Courier New" w:cs="Courier New" w:eastAsia="Courier New" w:hAnsi="Courier New"/>
+          <w:color w:val="0F2A44"/>
+          <w:sz w:val="19"/>
+          <w:szCs w:val="19"/>
+        </w:rPr>
+        <w:t xml:space="preserve">      out[oc][oh][ow] = acc</w:t>
+      </w:r>
+    </w:p>
+    <w:p>
+      <w:pPr>
+        <w:spacing w:after="120" w:before="0"/>
+      </w:pPr>
+      <w:r>
+        <w:rPr>
+          <w:rFonts w:ascii="Calibri" w:cs="Calibri" w:eastAsia="Calibri" w:hAnsi="Calibri"/>
+          <w:b/>
+          <w:bCs/>
+          <w:color w:val="1A2733"/>
+          <w:sz w:val="22"/>
+          <w:szCs w:val="22"/>
+        </w:rPr>
+        <w:t xml:space="preserve">Năm operator còn lại — ngắn hơn nhiều:</w:t>
+      </w:r>
+    </w:p>
+    <w:p>
+      <w:pPr>
+        <w:shd w:fill="F2F6F8" w:val="clear"/>
+        <w:spacing w:after="0" w:before="100"/>
+        <w:ind w:left="200" w:right="200"/>
+      </w:pPr>
+      <w:r>
+        <w:rPr>
+          <w:rFonts w:ascii="Courier New" w:cs="Courier New" w:eastAsia="Courier New" w:hAnsi="Courier New"/>
+          <w:color w:val="0F2A44"/>
+          <w:sz w:val="19"/>
+          <w:szCs w:val="19"/>
+        </w:rPr>
+        <w:t xml:space="preserve">relu:     out[i] = (x[i] &gt; 0) ? x[i] : 0</w:t>
+      </w:r>
+    </w:p>
+    <w:p>
+      <w:pPr>
+        <w:shd w:fill="F2F6F8" w:val="clear"/>
+        <w:spacing w:after="0" w:before="0"/>
+        <w:ind w:left="200" w:right="200"/>
+      </w:pPr>
+      <w:r>
+        <w:rPr>
+          <w:rFonts w:ascii="Courier New" w:cs="Courier New" w:eastAsia="Courier New" w:hAnsi="Courier New"/>
+          <w:color w:val="0F2A44"/>
+          <w:sz w:val="19"/>
+          <w:szCs w:val="19"/>
+        </w:rPr>
+        <w:t xml:space="preserve"> </w:t>
+      </w:r>
+    </w:p>
+    <w:p>
+      <w:pPr>
+        <w:shd w:fill="F2F6F8" w:val="clear"/>
+        <w:spacing w:after="0" w:before="0"/>
+        <w:ind w:left="200" w:right="200"/>
+      </w:pPr>
+      <w:r>
+        <w:rPr>
+          <w:rFonts w:ascii="Courier New" w:cs="Courier New" w:eastAsia="Courier New" w:hAnsi="Courier New"/>
+          <w:color w:val="0F2A44"/>
+          <w:sz w:val="19"/>
+          <w:szCs w:val="19"/>
+        </w:rPr>
+        <w:t xml:space="preserve">maxpool:  m = in[c][2*oh][2*ow]</w:t>
+      </w:r>
+    </w:p>
+    <w:p>
+      <w:pPr>
+        <w:shd w:fill="F2F6F8" w:val="clear"/>
+        <w:spacing w:after="0" w:before="0"/>
+        <w:ind w:left="200" w:right="200"/>
+      </w:pPr>
+      <w:r>
+        <w:rPr>
+          <w:rFonts w:ascii="Courier New" w:cs="Courier New" w:eastAsia="Courier New" w:hAnsi="Courier New"/>
+          <w:color w:val="0F2A44"/>
+          <w:sz w:val="19"/>
+          <w:szCs w:val="19"/>
+        </w:rPr>
+        <w:t xml:space="preserve">          for kh in 0..1: for kw in 0..1:</w:t>
+      </w:r>
+    </w:p>
+    <w:p>
+      <w:pPr>
+        <w:shd w:fill="F2F6F8" w:val="clear"/>
+        <w:spacing w:after="0" w:before="0"/>
+        <w:ind w:left="200" w:right="200"/>
+      </w:pPr>
+      <w:r>
+        <w:rPr>
+          <w:rFonts w:ascii="Courier New" w:cs="Courier New" w:eastAsia="Courier New" w:hAnsi="Courier New"/>
+          <w:color w:val="0F2A44"/>
+          <w:sz w:val="19"/>
+          <w:szCs w:val="19"/>
+        </w:rPr>
+        <w:t xml:space="preserve">            m = max(m, in[c][2*oh+kh][2*ow+kw])</w:t>
+      </w:r>
+    </w:p>
+    <w:p>
+      <w:pPr>
+        <w:shd w:fill="F2F6F8" w:val="clear"/>
+        <w:spacing w:after="0" w:before="0"/>
+        <w:ind w:left="200" w:right="200"/>
+      </w:pPr>
+      <w:r>
+        <w:rPr>
+          <w:rFonts w:ascii="Courier New" w:cs="Courier New" w:eastAsia="Courier New" w:hAnsi="Courier New"/>
+          <w:color w:val="0F2A44"/>
+          <w:sz w:val="19"/>
+          <w:szCs w:val="19"/>
+        </w:rPr>
+        <w:t xml:space="preserve">          out[c][oh][ow] = m</w:t>
+      </w:r>
+    </w:p>
+    <w:p>
+      <w:pPr>
+        <w:shd w:fill="F2F6F8" w:val="clear"/>
+        <w:spacing w:after="0" w:before="0"/>
+        <w:ind w:left="200" w:right="200"/>
+      </w:pPr>
+      <w:r>
+        <w:rPr>
+          <w:rFonts w:ascii="Courier New" w:cs="Courier New" w:eastAsia="Courier New" w:hAnsi="Courier New"/>
+          <w:color w:val="0F2A44"/>
+          <w:sz w:val="19"/>
+          <w:szCs w:val="19"/>
+        </w:rPr>
+        <w:t xml:space="preserve"> </w:t>
+      </w:r>
+    </w:p>
+    <w:p>
+      <w:pPr>
+        <w:shd w:fill="F2F6F8" w:val="clear"/>
+        <w:spacing w:after="0" w:before="0"/>
+        <w:ind w:left="200" w:right="200"/>
+      </w:pPr>
+      <w:r>
+        <w:rPr>
+          <w:rFonts w:ascii="Courier New" w:cs="Courier New" w:eastAsia="Courier New" w:hAnsi="Courier New"/>
+          <w:color w:val="0F2A44"/>
+          <w:sz w:val="19"/>
+          <w:szCs w:val="19"/>
+        </w:rPr>
+        <w:t xml:space="preserve">flatten:  idx = c*(H*W) + h*W + w     // NCHW: kênh, hàng, cột</w:t>
+      </w:r>
+    </w:p>
+    <w:p>
+      <w:pPr>
+        <w:shd w:fill="F2F6F8" w:val="clear"/>
+        <w:spacing w:after="0" w:before="0"/>
+        <w:ind w:left="200" w:right="200"/>
+      </w:pPr>
+      <w:r>
+        <w:rPr>
+          <w:rFonts w:ascii="Courier New" w:cs="Courier New" w:eastAsia="Courier New" w:hAnsi="Courier New"/>
+          <w:color w:val="0F2A44"/>
+          <w:sz w:val="19"/>
+          <w:szCs w:val="19"/>
+        </w:rPr>
+        <w:t xml:space="preserve"> </w:t>
+      </w:r>
+    </w:p>
+    <w:p>
+      <w:pPr>
+        <w:shd w:fill="F2F6F8" w:val="clear"/>
+        <w:spacing w:after="0" w:before="0"/>
+        <w:ind w:left="200" w:right="200"/>
+      </w:pPr>
+      <w:r>
+        <w:rPr>
+          <w:rFonts w:ascii="Courier New" w:cs="Courier New" w:eastAsia="Courier New" w:hAnsi="Courier New"/>
+          <w:color w:val="0F2A44"/>
+          <w:sz w:val="19"/>
+          <w:szCs w:val="19"/>
+        </w:rPr>
+        <w:t xml:space="preserve">linear:   for o in 0..9:</w:t>
+      </w:r>
+    </w:p>
+    <w:p>
+      <w:pPr>
+        <w:shd w:fill="F2F6F8" w:val="clear"/>
+        <w:spacing w:after="0" w:before="0"/>
+        <w:ind w:left="200" w:right="200"/>
+      </w:pPr>
+      <w:r>
+        <w:rPr>
+          <w:rFonts w:ascii="Courier New" w:cs="Courier New" w:eastAsia="Courier New" w:hAnsi="Courier New"/>
+          <w:color w:val="0F2A44"/>
+          <w:sz w:val="19"/>
+          <w:szCs w:val="19"/>
+        </w:rPr>
+        <w:t xml:space="preserve">            acc = b[o]</w:t>
+      </w:r>
+    </w:p>
+    <w:p>
+      <w:pPr>
+        <w:shd w:fill="F2F6F8" w:val="clear"/>
+        <w:spacing w:after="0" w:before="0"/>
+        <w:ind w:left="200" w:right="200"/>
+      </w:pPr>
+      <w:r>
+        <w:rPr>
+          <w:rFonts w:ascii="Courier New" w:cs="Courier New" w:eastAsia="Courier New" w:hAnsi="Courier New"/>
+          <w:color w:val="0F2A44"/>
+          <w:sz w:val="19"/>
+          <w:szCs w:val="19"/>
+        </w:rPr>
+        <w:t xml:space="preserve">            for i in 0..143: acc += x[i] * W[o][i]</w:t>
+      </w:r>
+    </w:p>
+    <w:p>
+      <w:pPr>
+        <w:shd w:fill="F2F6F8" w:val="clear"/>
+        <w:spacing w:after="0" w:before="0"/>
+        <w:ind w:left="200" w:right="200"/>
+      </w:pPr>
+      <w:r>
+        <w:rPr>
+          <w:rFonts w:ascii="Courier New" w:cs="Courier New" w:eastAsia="Courier New" w:hAnsi="Courier New"/>
+          <w:color w:val="0F2A44"/>
+          <w:sz w:val="19"/>
+          <w:szCs w:val="19"/>
+        </w:rPr>
+        <w:t xml:space="preserve">            z[o] = acc</w:t>
+      </w:r>
+    </w:p>
+    <w:p>
+      <w:pPr>
+        <w:shd w:fill="F2F6F8" w:val="clear"/>
+        <w:spacing w:after="0" w:before="0"/>
+        <w:ind w:left="200" w:right="200"/>
+      </w:pPr>
+      <w:r>
+        <w:rPr>
+          <w:rFonts w:ascii="Courier New" w:cs="Courier New" w:eastAsia="Courier New" w:hAnsi="Courier New"/>
+          <w:color w:val="0F2A44"/>
+          <w:sz w:val="19"/>
+          <w:szCs w:val="19"/>
+        </w:rPr>
+        <w:t xml:space="preserve"> </w:t>
+      </w:r>
+    </w:p>
+    <w:p>
+      <w:pPr>
+        <w:shd w:fill="F2F6F8" w:val="clear"/>
+        <w:spacing w:after="0" w:before="0"/>
+        <w:ind w:left="200" w:right="200"/>
+      </w:pPr>
+      <w:r>
+        <w:rPr>
+          <w:rFonts w:ascii="Courier New" w:cs="Courier New" w:eastAsia="Courier New" w:hAnsi="Courier New"/>
+          <w:color w:val="0F2A44"/>
+          <w:sz w:val="19"/>
+          <w:szCs w:val="19"/>
+        </w:rPr>
+        <w:t xml:space="preserve">argmax:   best = 0</w:t>
+      </w:r>
+    </w:p>
+    <w:p>
+      <w:pPr>
+        <w:shd w:fill="F2F6F8" w:val="clear"/>
+        <w:spacing w:after="0" w:before="0"/>
+        <w:ind w:left="200" w:right="200"/>
+      </w:pPr>
+      <w:r>
+        <w:rPr>
+          <w:rFonts w:ascii="Courier New" w:cs="Courier New" w:eastAsia="Courier New" w:hAnsi="Courier New"/>
+          <w:color w:val="0F2A44"/>
+          <w:sz w:val="19"/>
+          <w:szCs w:val="19"/>
+        </w:rPr>
+        <w:t xml:space="preserve">          for i in 1..9:</w:t>
+      </w:r>
+    </w:p>
+    <w:p>
+      <w:pPr>
+        <w:shd w:fill="F2F6F8" w:val="clear"/>
+        <w:spacing w:after="160" w:before="0"/>
+        <w:ind w:left="200" w:right="200"/>
+      </w:pPr>
+      <w:r>
+        <w:rPr>
+          <w:rFonts w:ascii="Courier New" w:cs="Courier New" w:eastAsia="Courier New" w:hAnsi="Courier New"/>
+          <w:color w:val="0F2A44"/>
+          <w:sz w:val="19"/>
+          <w:szCs w:val="19"/>
+        </w:rPr>
+        <w:t xml:space="preserve">            if z[i] &gt; z[best]: best = i   // '&gt;' chứ không '&gt;='</w:t>
+      </w:r>
+    </w:p>
+    <w:p>
+      <w:pPr>
+        <w:pBdr>
+          <w:left w:val="single" w:color="1C7293" w:sz="12" w:space="8"/>
+        </w:pBdr>
+        <w:shd w:fill="F7FAFB" w:val="clear"/>
+        <w:spacing w:after="180" w:before="100"/>
+        <w:ind w:left="160" w:right="160"/>
+      </w:pPr>
+      <w:r>
+        <w:rPr>
+          <w:rFonts w:ascii="Calibri" w:cs="Calibri" w:eastAsia="Calibri" w:hAnsi="Calibri"/>
+          <w:i/>
+          <w:iCs/>
+          <w:color w:val="5F7183"/>
+          <w:sz w:val="21"/>
+          <w:szCs w:val="21"/>
+        </w:rPr>
+        <w:t xml:space="preserve">Hai chi tiết nhỏ trong mã giả trên là hai lỗi thường gặp nhất. Một là accumulator phải khởi tạo bằng bias chứ không phải 0 — sai chỗ này thì kết quả lệch đúng bằng bias, con số vẫn trông hợp lý nên rất khó nhìn ra. Hai là argmax phải so sánh chặt (&gt;) để khi có hai logit bằng nhau thì trả về chỉ số nhỏ hơn, giống hành vi của torch.argmax; viết &gt;= sẽ trả về chỉ số lớn hơn và hai bản không còn khớp từng ảnh.</w:t>
+      </w:r>
+    </w:p>
+    <w:p>
+      <w:pPr>
+        <w:pStyle w:val="Heading2"/>
+      </w:pPr>
+      <w:r>
+        <w:t xml:space="preserve">5.3 Hai chỗ bỏ được phép toán, không mất một bit nào</w:t>
+      </w:r>
+    </w:p>
+    <w:p>
+      <w:pPr>
+        <w:spacing w:after="120" w:before="0"/>
+      </w:pPr>
+      <w:r>
+        <w:rPr>
+          <w:rFonts w:ascii="Calibri" w:cs="Calibri" w:eastAsia="Calibri" w:hAnsi="Calibri"/>
+          <w:color w:val="1A2733"/>
+          <w:sz w:val="22"/>
+          <w:szCs w:val="22"/>
+        </w:rPr>
+        <w:t xml:space="preserve">Yêu cầu "thay hoặc bỏ phép toán khó triển khai xuống FPGA" có hai chỗ làm được ngay trên SmallCNN. Điểm đáng nói: cả hai không phải xấp xỉ — kết quả giống hệt bản gốc, chứng minh được bằng tính đơn điệu chứ không phải bằng thực nghiệm.</w:t>
+      </w:r>
+    </w:p>
+    <w:tbl>
+      <w:tblPr>
+        <w:tblW w:type="dxa" w:w="9026"/>
+        <w:tblBorders>
+          <w:top w:val="single" w:color="auto" w:sz="4"/>
+          <w:left w:val="single" w:color="auto" w:sz="4"/>
+          <w:bottom w:val="single" w:color="auto" w:sz="4"/>
+          <w:right w:val="single" w:color="auto" w:sz="4"/>
+          <w:insideH w:val="single" w:color="auto" w:sz="4"/>
+          <w:insideV w:val="single" w:color="auto" w:sz="4"/>
+        </w:tblBorders>
+      </w:tblPr>
+      <w:tblGrid>
+        <w:gridCol w:w="2100"/>
+        <w:gridCol w:w="2300"/>
+        <w:gridCol w:w="4626"/>
+      </w:tblGrid>
+      <w:tr>
+        <w:trPr>
+          <w:tblHeader/>
+        </w:trPr>
+        <w:tc>
+          <w:tcPr>
+            <w:tcW w:type="dxa" w:w="2100"/>
+            <w:shd w:fill="0F2A44" w:val="clear"/>
+            <w:tcMar>
+              <w:top w:type="dxa" w:w="70"/>
+              <w:left w:type="dxa" w:w="110"/>
+              <w:bottom w:type="dxa" w:w="70"/>
+              <w:right w:type="dxa" w:w="110"/>
+            </w:tcMar>
+          </w:tcPr>
+          <w:p>
+            <w:pPr>
+              <w:spacing w:after="0"/>
+            </w:pPr>
+            <w:r>
+              <w:rPr>
+                <w:rFonts w:ascii="Calibri" w:cs="Calibri" w:eastAsia="Calibri" w:hAnsi="Calibri"/>
+                <w:b/>
+                <w:bCs/>
+                <w:color w:val="FFFFFF"/>
+                <w:sz w:val="19"/>
+                <w:szCs w:val="19"/>
+              </w:rPr>
+              <w:t xml:space="preserve">Bỏ gì</w:t>
+            </w:r>
+          </w:p>
+        </w:tc>
+        <w:tc>
+          <w:tcPr>
+            <w:tcW w:type="dxa" w:w="2300"/>
+            <w:shd w:fill="0F2A44" w:val="clear"/>
+            <w:tcMar>
+              <w:top w:type="dxa" w:w="70"/>
+              <w:left w:type="dxa" w:w="110"/>
+              <w:bottom w:type="dxa" w:w="70"/>
+              <w:right w:type="dxa" w:w="110"/>
+            </w:tcMar>
+          </w:tcPr>
+          <w:p>
+            <w:pPr>
+              <w:spacing w:after="0"/>
+            </w:pPr>
+            <w:r>
+              <w:rPr>
+                <w:rFonts w:ascii="Calibri" w:cs="Calibri" w:eastAsia="Calibri" w:hAnsi="Calibri"/>
+                <w:b/>
+                <w:bCs/>
+                <w:color w:val="FFFFFF"/>
+                <w:sz w:val="19"/>
+                <w:szCs w:val="19"/>
+              </w:rPr>
+              <w:t xml:space="preserve">Tiết kiệm</w:t>
+            </w:r>
+          </w:p>
+        </w:tc>
+        <w:tc>
+          <w:tcPr>
+            <w:tcW w:type="dxa" w:w="4626"/>
+            <w:shd w:fill="0F2A44" w:val="clear"/>
+            <w:tcMar>
+              <w:top w:type="dxa" w:w="70"/>
+              <w:left w:type="dxa" w:w="110"/>
+              <w:bottom w:type="dxa" w:w="70"/>
+              <w:right w:type="dxa" w:w="110"/>
+            </w:tcMar>
+          </w:tcPr>
+          <w:p>
+            <w:pPr>
+              <w:spacing w:after="0"/>
+            </w:pPr>
+            <w:r>
+              <w:rPr>
+                <w:rFonts w:ascii="Calibri" w:cs="Calibri" w:eastAsia="Calibri" w:hAnsi="Calibri"/>
+                <w:b/>
+                <w:bCs/>
+                <w:color w:val="FFFFFF"/>
+                <w:sz w:val="19"/>
+                <w:szCs w:val="19"/>
+              </w:rPr>
+              <w:t xml:space="preserve">Vì sao kết quả không đổi</w:t>
+            </w:r>
+          </w:p>
+        </w:tc>
+      </w:tr>
+      <w:tr>
+        <w:tc>
+          <w:tcPr>
+            <w:tcW w:type="dxa" w:w="2100"/>
+            <w:shd w:fill="F4F8FA" w:val="clear"/>
+            <w:tcMar>
+              <w:top w:type="dxa" w:w="70"/>
+              <w:left w:type="dxa" w:w="110"/>
+              <w:bottom w:type="dxa" w:w="70"/>
+              <w:right w:type="dxa" w:w="110"/>
+            </w:tcMar>
+          </w:tcPr>
+          <w:p>
+            <w:pPr>
+              <w:spacing w:after="0"/>
+            </w:pPr>
+            <w:r>
+              <w:rPr>
+                <w:rFonts w:ascii="Calibri" w:cs="Calibri" w:eastAsia="Calibri" w:hAnsi="Calibri"/>
+                <w:b/>
+                <w:bCs/>
+                <w:color w:val="1A2733"/>
+                <w:sz w:val="19"/>
+                <w:szCs w:val="19"/>
+              </w:rPr>
+              <w:t xml:space="preserve">Softmax ở lớp cuối</w:t>
+            </w:r>
+          </w:p>
+        </w:tc>
+        <w:tc>
+          <w:tcPr>
+            <w:tcW w:type="dxa" w:w="2300"/>
+            <w:shd w:fill="F4F8FA" w:val="clear"/>
+            <w:tcMar>
+              <w:top w:type="dxa" w:w="70"/>
+              <w:left w:type="dxa" w:w="110"/>
+              <w:bottom w:type="dxa" w:w="70"/>
+              <w:right w:type="dxa" w:w="110"/>
+            </w:tcMar>
+          </w:tcPr>
+          <w:p>
+            <w:pPr>
+              <w:spacing w:after="0"/>
+            </w:pPr>
+            <w:r>
+              <w:rPr>
+                <w:rFonts w:ascii="Calibri" w:cs="Calibri" w:eastAsia="Calibri" w:hAnsi="Calibri"/>
+                <w:color w:val="1A2733"/>
+                <w:sz w:val="19"/>
+                <w:szCs w:val="19"/>
+              </w:rPr>
+              <w:t xml:space="preserve">10 phép exp() và 1 phép chia</w:t>
+            </w:r>
+          </w:p>
+        </w:tc>
+        <w:tc>
+          <w:tcPr>
+            <w:tcW w:type="dxa" w:w="4626"/>
+            <w:shd w:fill="F4F8FA" w:val="clear"/>
+            <w:tcMar>
+              <w:top w:type="dxa" w:w="70"/>
+              <w:left w:type="dxa" w:w="110"/>
+              <w:bottom w:type="dxa" w:w="70"/>
+              <w:right w:type="dxa" w:w="110"/>
+            </w:tcMar>
+          </w:tcPr>
+          <w:p>
+            <w:pPr>
+              <w:spacing w:after="0"/>
+            </w:pPr>
+            <w:r>
+              <w:rPr>
+                <w:rFonts w:ascii="Calibri" w:cs="Calibri" w:eastAsia="Calibri" w:hAnsi="Calibri"/>
+                <w:color w:val="1A2733"/>
+                <w:sz w:val="19"/>
+                <w:szCs w:val="19"/>
+              </w:rPr>
+              <w:t xml:space="preserve">exp là hàm đơn điệu tăng nên không đổi thứ tự các logit → argmax cho cùng kết quả. Chỉ mất giá trị xác suất, mà chip không cần xác suất, chỉ cần chữ số</w:t>
+            </w:r>
+          </w:p>
+        </w:tc>
+      </w:tr>
+      <w:tr>
+        <w:tc>
+          <w:tcPr>
+            <w:tcW w:type="dxa" w:w="2100"/>
+            <w:shd w:fill="F4F8FA" w:val="clear"/>
+            <w:tcMar>
+              <w:top w:type="dxa" w:w="70"/>
+              <w:left w:type="dxa" w:w="110"/>
+              <w:bottom w:type="dxa" w:w="70"/>
+              <w:right w:type="dxa" w:w="110"/>
+            </w:tcMar>
+          </w:tcPr>
+          <w:p>
+            <w:pPr>
+              <w:spacing w:after="0"/>
+            </w:pPr>
+            <w:r>
+              <w:rPr>
+                <w:rFonts w:ascii="Calibri" w:cs="Calibri" w:eastAsia="Calibri" w:hAnsi="Calibri"/>
+                <w:b/>
+                <w:bCs/>
+                <w:color w:val="1A2733"/>
+                <w:sz w:val="19"/>
+                <w:szCs w:val="19"/>
+              </w:rPr>
+              <w:t xml:space="preserve">Đổi thứ tự relu ↔ maxpool</w:t>
+            </w:r>
+          </w:p>
+        </w:tc>
+        <w:tc>
+          <w:tcPr>
+            <w:tcW w:type="dxa" w:w="2300"/>
+            <w:shd w:fill="F4F8FA" w:val="clear"/>
+            <w:tcMar>
+              <w:top w:type="dxa" w:w="70"/>
+              <w:left w:type="dxa" w:w="110"/>
+              <w:bottom w:type="dxa" w:w="70"/>
+              <w:right w:type="dxa" w:w="110"/>
+            </w:tcMar>
+          </w:tcPr>
+          <w:p>
+            <w:pPr>
+              <w:spacing w:after="0"/>
+            </w:pPr>
+            <w:r>
+              <w:rPr>
+                <w:rFonts w:ascii="Calibri" w:cs="Calibri" w:eastAsia="Calibri" w:hAnsi="Calibri"/>
+                <w:color w:val="1A2733"/>
+                <w:sz w:val="19"/>
+                <w:szCs w:val="19"/>
+              </w:rPr>
+              <w:t xml:space="preserve">10.192 → 2.496 phép ReLU (4,08 lần)</w:t>
+            </w:r>
+          </w:p>
+        </w:tc>
+        <w:tc>
+          <w:tcPr>
+            <w:tcW w:type="dxa" w:w="4626"/>
+            <w:shd w:fill="F4F8FA" w:val="clear"/>
+            <w:tcMar>
+              <w:top w:type="dxa" w:w="70"/>
+              <w:left w:type="dxa" w:w="110"/>
+              <w:bottom w:type="dxa" w:w="70"/>
+              <w:right w:type="dxa" w:w="110"/>
+            </w:tcMar>
+          </w:tcPr>
+          <w:p>
+            <w:pPr>
+              <w:spacing w:after="0"/>
+            </w:pPr>
+            <w:r>
+              <w:rPr>
+                <w:rFonts w:ascii="Calibri" w:cs="Calibri" w:eastAsia="Calibri" w:hAnsi="Calibri"/>
+                <w:color w:val="1A2733"/>
+                <w:sz w:val="19"/>
+                <w:szCs w:val="19"/>
+              </w:rPr>
+              <w:t xml:space="preserve">max và relu đều đơn điệu không giảm nên hoán vị được. Làm ReLU sau pool thì chỉ phải xử lý số phần tử đã bị pool thu nhỏ</w:t>
+            </w:r>
+          </w:p>
+        </w:tc>
+      </w:tr>
+    </w:tbl>
+    <w:p>
+      <w:pPr>
+        <w:spacing w:after="120"/>
+      </w:pPr>
+    </w:p>
+    <w:p>
+      <w:pPr>
+        <w:pBdr>
+          <w:left w:val="single" w:color="1C7293" w:sz="12" w:space="8"/>
+        </w:pBdr>
+        <w:shd w:fill="F7FAFB" w:val="clear"/>
+        <w:spacing w:after="180" w:before="100"/>
+        <w:ind w:left="160" w:right="160"/>
+      </w:pPr>
+      <w:r>
+        <w:rPr>
+          <w:rFonts w:ascii="Calibri" w:cs="Calibri" w:eastAsia="Calibri" w:hAnsi="Calibri"/>
+          <w:i/>
+          <w:iCs/>
+          <w:color w:val="5F7183"/>
+          <w:sz w:val="21"/>
+          <w:szCs w:val="21"/>
+        </w:rPr>
+        <w:t xml:space="preserve">Chỗ dễ ghi sai: không phải đúng 4 lần. Lấy 10.192 chia 4 ra 2.548 là sai 52 phép. Hai pool đầu chia đúng 4 (28→14, 14→7), nhưng pool cuối 7→3 bị floor cắt hàng và cột cuối, nên 16·7·7 = 784 phần tử vào mà chỉ ra 16·3·3 = 144, tức chia 5,44. Cùng một hành vi floor đã nói ở mục 4.3 — nó không chỉ đổi shape, nó đổi cả phép đếm. Tổng phép tính mỗi ảnh sau khi đổi thứ tự: 406.569 thay vì 414.265.</w:t>
+      </w:r>
+    </w:p>
+    <w:p>
+      <w:pPr>
+        <w:spacing w:after="120" w:before="0"/>
+      </w:pPr>
+      <w:r>
+        <w:rPr>
+          <w:rFonts w:ascii="Calibri" w:cs="Calibri" w:eastAsia="Calibri" w:hAnsi="Calibri"/>
+          <w:b/>
+          <w:bCs/>
+          <w:color w:val="1A2733"/>
+          <w:sz w:val="22"/>
+          <w:szCs w:val="22"/>
+        </w:rPr>
+        <w:t xml:space="preserve">Hệ quả quan trọng nhất: đường inference không còn hàm siêu việt nào. </w:t>
+      </w:r>
+      <w:r>
+        <w:rPr>
+          <w:rFonts w:ascii="Calibri" w:cs="Calibri" w:eastAsia="Calibri" w:hAnsi="Calibri"/>
+          <w:color w:val="1A2733"/>
+          <w:sz w:val="22"/>
+          <w:szCs w:val="22"/>
+        </w:rPr>
+        <w:t xml:space="preserve">Sau khi bỏ softmax, toàn bộ 12 bước chỉ dùng phép cộng, phép nhân và phép so sánh. Không exp, không sqrt, không chia, không log. Nghĩa là golden model C không cần math.h — chỉ stdio.h và stdlib.h là đủ. Đây cũng là hướng Thầy nhắc: tránh các phép exp và sqrt khi nhắm tới FPGA.</w:t>
+      </w:r>
+    </w:p>
+    <w:p>
+      <w:pPr>
+        <w:pStyle w:val="Heading2"/>
+      </w:pPr>
+      <w:r>
+        <w:t xml:space="preserve">5.4 Ba bẫy khi port sang C</w:t>
+      </w:r>
+    </w:p>
+    <w:p>
+      <w:pPr>
+        <w:spacing w:after="120" w:before="0"/>
+      </w:pPr>
+      <w:r>
+        <w:rPr>
+          <w:rFonts w:ascii="Calibri" w:cs="Calibri" w:eastAsia="Calibri" w:hAnsi="Calibri"/>
+          <w:b/>
+          <w:bCs/>
+          <w:color w:val="1A2733"/>
+          <w:sz w:val="22"/>
+          <w:szCs w:val="22"/>
+        </w:rPr>
+        <w:t xml:space="preserve">Điểm chung của cả ba: chương trình không crash. </w:t>
+      </w:r>
+      <w:r>
+        <w:rPr>
+          <w:rFonts w:ascii="Calibri" w:cs="Calibri" w:eastAsia="Calibri" w:hAnsi="Calibri"/>
+          <w:color w:val="1A2733"/>
+          <w:sz w:val="22"/>
+          <w:szCs w:val="22"/>
+        </w:rPr>
+        <w:t xml:space="preserve">Nó chạy trọn vẹn, in ra một con số, và con số đó sai. Vì vậy cách kiểm phải là so từng lớp với PyTorch, không phải chỉ so accuracy cuối.</w:t>
+      </w:r>
+    </w:p>
+    <w:tbl>
+      <w:tblPr>
+        <w:tblW w:type="dxa" w:w="9026"/>
+        <w:tblBorders>
+          <w:top w:val="single" w:color="auto" w:sz="4"/>
+          <w:left w:val="single" w:color="auto" w:sz="4"/>
+          <w:bottom w:val="single" w:color="auto" w:sz="4"/>
+          <w:right w:val="single" w:color="auto" w:sz="4"/>
+          <w:insideH w:val="single" w:color="auto" w:sz="4"/>
+          <w:insideV w:val="single" w:color="auto" w:sz="4"/>
+        </w:tblBorders>
+      </w:tblPr>
+      <w:tblGrid>
+        <w:gridCol w:w="2100"/>
+        <w:gridCol w:w="3200"/>
+        <w:gridCol w:w="3726"/>
+      </w:tblGrid>
+      <w:tr>
+        <w:trPr>
+          <w:tblHeader/>
+        </w:trPr>
+        <w:tc>
+          <w:tcPr>
+            <w:tcW w:type="dxa" w:w="2100"/>
+            <w:shd w:fill="0F2A44" w:val="clear"/>
+            <w:tcMar>
+              <w:top w:type="dxa" w:w="70"/>
+              <w:left w:type="dxa" w:w="110"/>
+              <w:bottom w:type="dxa" w:w="70"/>
+              <w:right w:type="dxa" w:w="110"/>
+            </w:tcMar>
+          </w:tcPr>
+          <w:p>
+            <w:pPr>
+              <w:spacing w:after="0"/>
+            </w:pPr>
+            <w:r>
+              <w:rPr>
+                <w:rFonts w:ascii="Calibri" w:cs="Calibri" w:eastAsia="Calibri" w:hAnsi="Calibri"/>
+                <w:b/>
+                <w:bCs/>
+                <w:color w:val="FFFFFF"/>
+                <w:sz w:val="19"/>
+                <w:szCs w:val="19"/>
+              </w:rPr>
+              <w:t xml:space="preserve">Bẫy</w:t>
+            </w:r>
+          </w:p>
+        </w:tc>
+        <w:tc>
+          <w:tcPr>
+            <w:tcW w:type="dxa" w:w="3200"/>
+            <w:shd w:fill="0F2A44" w:val="clear"/>
+            <w:tcMar>
+              <w:top w:type="dxa" w:w="70"/>
+              <w:left w:type="dxa" w:w="110"/>
+              <w:bottom w:type="dxa" w:w="70"/>
+              <w:right w:type="dxa" w:w="110"/>
+            </w:tcMar>
+          </w:tcPr>
+          <w:p>
+            <w:pPr>
+              <w:spacing w:after="0"/>
+            </w:pPr>
+            <w:r>
+              <w:rPr>
+                <w:rFonts w:ascii="Calibri" w:cs="Calibri" w:eastAsia="Calibri" w:hAnsi="Calibri"/>
+                <w:b/>
+                <w:bCs/>
+                <w:color w:val="FFFFFF"/>
+                <w:sz w:val="19"/>
+                <w:szCs w:val="19"/>
+              </w:rPr>
+              <w:t xml:space="preserve">Hậu quả</w:t>
+            </w:r>
+          </w:p>
+        </w:tc>
+        <w:tc>
+          <w:tcPr>
+            <w:tcW w:type="dxa" w:w="3726"/>
+            <w:shd w:fill="0F2A44" w:val="clear"/>
+            <w:tcMar>
+              <w:top w:type="dxa" w:w="70"/>
+              <w:left w:type="dxa" w:w="110"/>
+              <w:bottom w:type="dxa" w:w="70"/>
+              <w:right w:type="dxa" w:w="110"/>
+            </w:tcMar>
+          </w:tcPr>
+          <w:p>
+            <w:pPr>
+              <w:spacing w:after="0"/>
+            </w:pPr>
+            <w:r>
+              <w:rPr>
+                <w:rFonts w:ascii="Calibri" w:cs="Calibri" w:eastAsia="Calibri" w:hAnsi="Calibri"/>
+                <w:b/>
+                <w:bCs/>
+                <w:color w:val="FFFFFF"/>
+                <w:sz w:val="19"/>
+                <w:szCs w:val="19"/>
+              </w:rPr>
+              <w:t xml:space="preserve">Cách bắt</w:t>
+            </w:r>
+          </w:p>
+        </w:tc>
+      </w:tr>
+      <w:tr>
+        <w:tc>
+          <w:tcPr>
+            <w:tcW w:type="dxa" w:w="2100"/>
+            <w:shd w:fill="F4F8FA" w:val="clear"/>
+            <w:tcMar>
+              <w:top w:type="dxa" w:w="70"/>
+              <w:left w:type="dxa" w:w="110"/>
+              <w:bottom w:type="dxa" w:w="70"/>
+              <w:right w:type="dxa" w:w="110"/>
+            </w:tcMar>
+          </w:tcPr>
+          <w:p>
+            <w:pPr>
+              <w:spacing w:after="0"/>
+            </w:pPr>
+            <w:r>
+              <w:rPr>
+                <w:rFonts w:ascii="Calibri" w:cs="Calibri" w:eastAsia="Calibri" w:hAnsi="Calibri"/>
+                <w:b/>
+                <w:bCs/>
+                <w:color w:val="1A2733"/>
+                <w:sz w:val="19"/>
+                <w:szCs w:val="19"/>
+              </w:rPr>
+              <w:t xml:space="preserve">Layout NCHW so với NHWC ở flatten</w:t>
+            </w:r>
+          </w:p>
+        </w:tc>
+        <w:tc>
+          <w:tcPr>
+            <w:tcW w:type="dxa" w:w="3200"/>
+            <w:shd w:fill="F4F8FA" w:val="clear"/>
+            <w:tcMar>
+              <w:top w:type="dxa" w:w="70"/>
+              <w:left w:type="dxa" w:w="110"/>
+              <w:bottom w:type="dxa" w:w="70"/>
+              <w:right w:type="dxa" w:w="110"/>
+            </w:tcMar>
+          </w:tcPr>
+          <w:p>
+            <w:pPr>
+              <w:spacing w:after="0"/>
+            </w:pPr>
+            <w:r>
+              <w:rPr>
+                <w:rFonts w:ascii="Calibri" w:cs="Calibri" w:eastAsia="Calibri" w:hAnsi="Calibri"/>
+                <w:color w:val="1A2733"/>
+                <w:sz w:val="19"/>
+                <w:szCs w:val="19"/>
+              </w:rPr>
+              <w:t xml:space="preserve">Vector 144 bị hoán vị, mỗi trọng số của fc nhân với sai giá trị. Accuracy rơi về khoảng 10%, tức mức đoán bừa</w:t>
+            </w:r>
+          </w:p>
+        </w:tc>
+        <w:tc>
+          <w:tcPr>
+            <w:tcW w:type="dxa" w:w="3726"/>
+            <w:shd w:fill="F4F8FA" w:val="clear"/>
+            <w:tcMar>
+              <w:top w:type="dxa" w:w="70"/>
+              <w:left w:type="dxa" w:w="110"/>
+              <w:bottom w:type="dxa" w:w="70"/>
+              <w:right w:type="dxa" w:w="110"/>
+            </w:tcMar>
+          </w:tcPr>
+          <w:p>
+            <w:pPr>
+              <w:spacing w:after="0"/>
+            </w:pPr>
+            <w:r>
+              <w:rPr>
+                <w:rFonts w:ascii="Calibri" w:cs="Calibri" w:eastAsia="Calibri" w:hAnsi="Calibri"/>
+                <w:color w:val="1A2733"/>
+                <w:sz w:val="19"/>
+                <w:szCs w:val="19"/>
+              </w:rPr>
+              <w:t xml:space="preserve">In vector 144 từ PyTorch và từ C cho cùng một ảnh, so từng phần tử. Đừng chỉ so accuracy cuối</w:t>
+            </w:r>
+          </w:p>
+        </w:tc>
+      </w:tr>
+      <w:tr>
+        <w:tc>
+          <w:tcPr>
+            <w:tcW w:type="dxa" w:w="2100"/>
+            <w:shd w:fill="F4F8FA" w:val="clear"/>
+            <w:tcMar>
+              <w:top w:type="dxa" w:w="70"/>
+              <w:left w:type="dxa" w:w="110"/>
+              <w:bottom w:type="dxa" w:w="70"/>
+              <w:right w:type="dxa" w:w="110"/>
+            </w:tcMar>
+          </w:tcPr>
+          <w:p>
+            <w:pPr>
+              <w:spacing w:after="0"/>
+            </w:pPr>
+            <w:r>
+              <w:rPr>
+                <w:rFonts w:ascii="Calibri" w:cs="Calibri" w:eastAsia="Calibri" w:hAnsi="Calibri"/>
+                <w:b/>
+                <w:bCs/>
+                <w:color w:val="1A2733"/>
+                <w:sz w:val="19"/>
+                <w:szCs w:val="19"/>
+              </w:rPr>
+              <w:t xml:space="preserve">Thứ tự chiều của trọng số</w:t>
+            </w:r>
+          </w:p>
+        </w:tc>
+        <w:tc>
+          <w:tcPr>
+            <w:tcW w:type="dxa" w:w="3200"/>
+            <w:shd w:fill="F4F8FA" w:val="clear"/>
+            <w:tcMar>
+              <w:top w:type="dxa" w:w="70"/>
+              <w:left w:type="dxa" w:w="110"/>
+              <w:bottom w:type="dxa" w:w="70"/>
+              <w:right w:type="dxa" w:w="110"/>
+            </w:tcMar>
+          </w:tcPr>
+          <w:p>
+            <w:pPr>
+              <w:spacing w:after="0"/>
+            </w:pPr>
+            <w:r>
+              <w:rPr>
+                <w:rFonts w:ascii="Calibri" w:cs="Calibri" w:eastAsia="Calibri" w:hAnsi="Calibri"/>
+                <w:color w:val="1A2733"/>
+                <w:sz w:val="19"/>
+                <w:szCs w:val="19"/>
+              </w:rPr>
+              <w:t xml:space="preserve">PyTorch lưu [out][in], Keras lưu [in][out] — ngược nhau. Đọc sai thì mọi lớp lệch</w:t>
+            </w:r>
+          </w:p>
+        </w:tc>
+        <w:tc>
+          <w:tcPr>
+            <w:tcW w:type="dxa" w:w="3726"/>
+            <w:shd w:fill="F4F8FA" w:val="clear"/>
+            <w:tcMar>
+              <w:top w:type="dxa" w:w="70"/>
+              <w:left w:type="dxa" w:w="110"/>
+              <w:bottom w:type="dxa" w:w="70"/>
+              <w:right w:type="dxa" w:w="110"/>
+            </w:tcMar>
+          </w:tcPr>
+          <w:p>
+            <w:pPr>
+              <w:spacing w:after="0"/>
+            </w:pPr>
+            <w:r>
+              <w:rPr>
+                <w:rFonts w:ascii="Calibri" w:cs="Calibri" w:eastAsia="Calibri" w:hAnsi="Calibri"/>
+                <w:color w:val="1A2733"/>
+                <w:sz w:val="19"/>
+                <w:szCs w:val="19"/>
+              </w:rPr>
+              <w:t xml:space="preserve">Kiểm shape của từng tensor ngay khi trích tham số ra file, trước khi viết C</w:t>
+            </w:r>
+          </w:p>
+        </w:tc>
+      </w:tr>
+      <w:tr>
+        <w:tc>
+          <w:tcPr>
+            <w:tcW w:type="dxa" w:w="2100"/>
+            <w:shd w:fill="F4F8FA" w:val="clear"/>
+            <w:tcMar>
+              <w:top w:type="dxa" w:w="70"/>
+              <w:left w:type="dxa" w:w="110"/>
+              <w:bottom w:type="dxa" w:w="70"/>
+              <w:right w:type="dxa" w:w="110"/>
+            </w:tcMar>
+          </w:tcPr>
+          <w:p>
+            <w:pPr>
+              <w:spacing w:after="0"/>
+            </w:pPr>
+            <w:r>
+              <w:rPr>
+                <w:rFonts w:ascii="Calibri" w:cs="Calibri" w:eastAsia="Calibri" w:hAnsi="Calibri"/>
+                <w:b/>
+                <w:bCs/>
+                <w:color w:val="1A2733"/>
+                <w:sz w:val="19"/>
+                <w:szCs w:val="19"/>
+              </w:rPr>
+              <w:t xml:space="preserve">Accumulator khởi tạo bằng 0 thay vì bias</w:t>
+            </w:r>
+          </w:p>
+        </w:tc>
+        <w:tc>
+          <w:tcPr>
+            <w:tcW w:type="dxa" w:w="3200"/>
+            <w:shd w:fill="F4F8FA" w:val="clear"/>
+            <w:tcMar>
+              <w:top w:type="dxa" w:w="70"/>
+              <w:left w:type="dxa" w:w="110"/>
+              <w:bottom w:type="dxa" w:w="70"/>
+              <w:right w:type="dxa" w:w="110"/>
+            </w:tcMar>
+          </w:tcPr>
+          <w:p>
+            <w:pPr>
+              <w:spacing w:after="0"/>
+            </w:pPr>
+            <w:r>
+              <w:rPr>
+                <w:rFonts w:ascii="Calibri" w:cs="Calibri" w:eastAsia="Calibri" w:hAnsi="Calibri"/>
+                <w:color w:val="1A2733"/>
+                <w:sz w:val="19"/>
+                <w:szCs w:val="19"/>
+              </w:rPr>
+              <w:t xml:space="preserve">Kết quả lệch đúng bằng bias ở mọi phần tử. Con số vẫn trông hợp lý nên khó nhìn ra</w:t>
+            </w:r>
+          </w:p>
+        </w:tc>
+        <w:tc>
+          <w:tcPr>
+            <w:tcW w:type="dxa" w:w="3726"/>
+            <w:shd w:fill="F4F8FA" w:val="clear"/>
+            <w:tcMar>
+              <w:top w:type="dxa" w:w="70"/>
+              <w:left w:type="dxa" w:w="110"/>
+              <w:bottom w:type="dxa" w:w="70"/>
+              <w:right w:type="dxa" w:w="110"/>
+            </w:tcMar>
+          </w:tcPr>
+          <w:p>
+            <w:pPr>
+              <w:spacing w:after="0"/>
+            </w:pPr>
+            <w:r>
+              <w:rPr>
+                <w:rFonts w:ascii="Calibri" w:cs="Calibri" w:eastAsia="Calibri" w:hAnsi="Calibri"/>
+                <w:color w:val="1A2733"/>
+                <w:sz w:val="19"/>
+                <w:szCs w:val="19"/>
+              </w:rPr>
+              <w:t xml:space="preserve">So giá trị lớp đầu tiên với PyTorch. Lệch một lượng không đổi là dấu hiệu của bẫy này</w:t>
+            </w:r>
+          </w:p>
+        </w:tc>
+      </w:tr>
+    </w:tbl>
+    <w:p>
+      <w:pPr>
+        <w:spacing w:after="120"/>
+      </w:pPr>
+    </w:p>
+    <w:p>
+      <w:pPr>
+        <w:pBdr>
+          <w:left w:val="single" w:color="1C7293" w:sz="12" w:space="8"/>
+        </w:pBdr>
+        <w:shd w:fill="F7FAFB" w:val="clear"/>
+        <w:spacing w:after="180" w:before="100"/>
+        <w:ind w:left="160" w:right="160"/>
+      </w:pPr>
+      <w:r>
+        <w:rPr>
+          <w:rFonts w:ascii="Calibri" w:cs="Calibri" w:eastAsia="Calibri" w:hAnsi="Calibri"/>
+          <w:i/>
+          <w:iCs/>
+          <w:color w:val="5F7183"/>
+          <w:sz w:val="21"/>
+          <w:szCs w:val="21"/>
+        </w:rPr>
+        <w:t xml:space="preserve">Còn một bẫy nữa chỉ xuất hiện khi chuyển sang số nguyên, ghi lại để khỏi quên: nếu lượng tử hoá fc sang int8 thì accumulator phải là int32, vì 144 × 127 × 127 = 2,3 triệu, tràn int16. Việc này thuộc giai đoạn sau golden model C float32, không làm bây giờ.</w:t>
+      </w:r>
+    </w:p>
+    <w:p>
+      <w:pPr>
+        <w:pStyle w:val="Heading1"/>
+      </w:pPr>
+      <w:r>
+        <w:t xml:space="preserve">6. Tham số — tăng hoặc giảm thì khác gì</w:t>
       </w:r>
     </w:p>
     <w:p>
@@ -5346,7 +8024,7 @@
         <w:pStyle w:val="Heading2"/>
       </w:pPr>
       <w:r>
-        <w:t xml:space="preserve">5.1 Nhóm ĐỔI số tham số — sửa kiến trúc</w:t>
+        <w:t xml:space="preserve">6.1 Nhóm ĐỔI số tham số — sửa kiến trúc</w:t>
       </w:r>
     </w:p>
     <w:tbl>
@@ -6126,7 +8804,7 @@
         <w:pStyle w:val="Heading2"/>
       </w:pPr>
       <w:r>
-        <w:t xml:space="preserve">5.2 Nhóm KHÔNG đổi số tham số — chỉ đổi cách học</w:t>
+        <w:t xml:space="preserve">6.2 Nhóm KHÔNG đổi số tham số — chỉ đổi cách học</w:t>
       </w:r>
     </w:p>
     <w:tbl>
@@ -6707,7 +9385,7 @@
           <w:sz w:val="21"/>
           <w:szCs w:val="21"/>
         </w:rPr>
-        <w:t xml:space="preserve">Ghi nhớ: data augmentation và mọi tham số ở mục 5.2 KHÔNG giảm được một tham số nào. Quantization cũng không — nó giảm số byte mỗi trọng số (4 → 1), chứ số trọng số giữ nguyên. Chỉ sửa kiến trúc (mục 5.1) mới giảm được số tham số.</w:t>
+        <w:t xml:space="preserve">Ghi nhớ: data augmentation và mọi tham số ở mục 6.2 KHÔNG giảm được một tham số nào. Quantization cũng không — nó giảm số byte mỗi trọng số (4 → 1), chứ số trọng số giữ nguyên. Chỉ sửa kiến trúc (mục 6.1) mới giảm được số tham số.</w:t>
       </w:r>
     </w:p>
     <w:p>
@@ -6715,7 +9393,7 @@
         <w:pStyle w:val="Heading2"/>
       </w:pPr>
       <w:r>
-        <w:t xml:space="preserve">5.3 Ví dụ tính tay: đổi padding từ 1 xuống 0</w:t>
+        <w:t xml:space="preserve">6.3 Ví dụ tính tay: đổi padding từ 1 xuống 0</w:t>
       </w:r>
     </w:p>
     <w:p>
@@ -7581,10 +10259,804 @@
     </w:p>
     <w:p>
       <w:pPr>
+        <w:pStyle w:val="Heading2"/>
+      </w:pPr>
+      <w:r>
+        <w:t xml:space="preserve">6.4 Biến thể: chỉ đổi padding của conv1</w:t>
+      </w:r>
+    </w:p>
+    <w:p>
+      <w:pPr>
+        <w:spacing w:after="120" w:before="0"/>
+      </w:pPr>
+      <w:r>
+        <w:rPr>
+          <w:rFonts w:ascii="Calibri" w:cs="Calibri" w:eastAsia="Calibri" w:hAnsi="Calibri"/>
+          <w:color w:val="1A2733"/>
+          <w:sz w:val="22"/>
+          <w:szCs w:val="22"/>
+        </w:rPr>
+        <w:t xml:space="preserve">Khác với mục 6.3 (đổi padding cả 3 lớp conv), ở đây chỉ đổi padding của riêng conv1 từ 1 xuống 0, giữ nguyên conv2 và conv3 ở padding = 1:</w:t>
+      </w:r>
+    </w:p>
+    <w:tbl>
+      <w:tblPr>
+        <w:tblW w:type="dxa" w:w="9026"/>
+        <w:tblBorders>
+          <w:top w:val="single" w:color="auto" w:sz="4"/>
+          <w:left w:val="single" w:color="auto" w:sz="4"/>
+          <w:bottom w:val="single" w:color="auto" w:sz="4"/>
+          <w:right w:val="single" w:color="auto" w:sz="4"/>
+          <w:insideH w:val="single" w:color="auto" w:sz="4"/>
+          <w:insideV w:val="single" w:color="auto" w:sz="4"/>
+        </w:tblBorders>
+      </w:tblPr>
+      <w:tblGrid>
+        <w:gridCol w:w="1900"/>
+        <w:gridCol w:w="3600"/>
+        <w:gridCol w:w="3526"/>
+      </w:tblGrid>
+      <w:tr>
+        <w:trPr>
+          <w:tblHeader/>
+        </w:trPr>
+        <w:tc>
+          <w:tcPr>
+            <w:tcW w:type="dxa" w:w="1900"/>
+            <w:shd w:fill="0F2A44" w:val="clear"/>
+            <w:tcMar>
+              <w:top w:type="dxa" w:w="70"/>
+              <w:left w:type="dxa" w:w="110"/>
+              <w:bottom w:type="dxa" w:w="70"/>
+              <w:right w:type="dxa" w:w="110"/>
+            </w:tcMar>
+          </w:tcPr>
+          <w:p>
+            <w:pPr>
+              <w:spacing w:after="0"/>
+            </w:pPr>
+            <w:r>
+              <w:rPr>
+                <w:rFonts w:ascii="Calibri" w:cs="Calibri" w:eastAsia="Calibri" w:hAnsi="Calibri"/>
+                <w:b/>
+                <w:bCs/>
+                <w:color w:val="FFFFFF"/>
+                <w:sz w:val="19"/>
+                <w:szCs w:val="19"/>
+              </w:rPr>
+              <w:t xml:space="preserve">Bước</w:t>
+            </w:r>
+          </w:p>
+        </w:tc>
+        <w:tc>
+          <w:tcPr>
+            <w:tcW w:type="dxa" w:w="3600"/>
+            <w:shd w:fill="0F2A44" w:val="clear"/>
+            <w:tcMar>
+              <w:top w:type="dxa" w:w="70"/>
+              <w:left w:type="dxa" w:w="110"/>
+              <w:bottom w:type="dxa" w:w="70"/>
+              <w:right w:type="dxa" w:w="110"/>
+            </w:tcMar>
+          </w:tcPr>
+          <w:p>
+            <w:pPr>
+              <w:spacing w:after="0"/>
+            </w:pPr>
+            <w:r>
+              <w:rPr>
+                <w:rFonts w:ascii="Calibri" w:cs="Calibri" w:eastAsia="Calibri" w:hAnsi="Calibri"/>
+                <w:b/>
+                <w:bCs/>
+                <w:color w:val="FFFFFF"/>
+                <w:sz w:val="19"/>
+                <w:szCs w:val="19"/>
+              </w:rPr>
+              <w:t xml:space="preserve">padding = 1 (mọi lớp, hiện tại)</w:t>
+            </w:r>
+          </w:p>
+        </w:tc>
+        <w:tc>
+          <w:tcPr>
+            <w:tcW w:type="dxa" w:w="3526"/>
+            <w:shd w:fill="0F2A44" w:val="clear"/>
+            <w:tcMar>
+              <w:top w:type="dxa" w:w="70"/>
+              <w:left w:type="dxa" w:w="110"/>
+              <w:bottom w:type="dxa" w:w="70"/>
+              <w:right w:type="dxa" w:w="110"/>
+            </w:tcMar>
+          </w:tcPr>
+          <w:p>
+            <w:pPr>
+              <w:spacing w:after="0"/>
+            </w:pPr>
+            <w:r>
+              <w:rPr>
+                <w:rFonts w:ascii="Calibri" w:cs="Calibri" w:eastAsia="Calibri" w:hAnsi="Calibri"/>
+                <w:b/>
+                <w:bCs/>
+                <w:color w:val="FFFFFF"/>
+                <w:sz w:val="19"/>
+                <w:szCs w:val="19"/>
+              </w:rPr>
+              <w:t xml:space="preserve">chỉ conv1 padding = 0</w:t>
+            </w:r>
+          </w:p>
+        </w:tc>
+      </w:tr>
+      <w:tr>
+        <w:tc>
+          <w:tcPr>
+            <w:tcW w:type="dxa" w:w="1900"/>
+            <w:shd w:fill="F4F8FA" w:val="clear"/>
+            <w:tcMar>
+              <w:top w:type="dxa" w:w="70"/>
+              <w:left w:type="dxa" w:w="110"/>
+              <w:bottom w:type="dxa" w:w="70"/>
+              <w:right w:type="dxa" w:w="110"/>
+            </w:tcMar>
+          </w:tcPr>
+          <w:p>
+            <w:pPr>
+              <w:spacing w:after="0"/>
+            </w:pPr>
+            <w:r>
+              <w:rPr>
+                <w:rFonts w:ascii="Calibri" w:cs="Calibri" w:eastAsia="Calibri" w:hAnsi="Calibri"/>
+                <w:b/>
+                <w:bCs/>
+                <w:color w:val="1A2733"/>
+                <w:sz w:val="19"/>
+                <w:szCs w:val="19"/>
+              </w:rPr>
+              <w:t xml:space="preserve">conv1</w:t>
+            </w:r>
+          </w:p>
+        </w:tc>
+        <w:tc>
+          <w:tcPr>
+            <w:tcW w:type="dxa" w:w="3600"/>
+            <w:shd w:fill="F4F8FA" w:val="clear"/>
+            <w:tcMar>
+              <w:top w:type="dxa" w:w="70"/>
+              <w:left w:type="dxa" w:w="110"/>
+              <w:bottom w:type="dxa" w:w="70"/>
+              <w:right w:type="dxa" w:w="110"/>
+            </w:tcMar>
+          </w:tcPr>
+          <w:p>
+            <w:pPr>
+              <w:spacing w:after="0"/>
+            </w:pPr>
+            <w:r>
+              <w:rPr>
+                <w:rFonts w:ascii="Calibri" w:cs="Calibri" w:eastAsia="Calibri" w:hAnsi="Calibri"/>
+                <w:color w:val="1A2733"/>
+                <w:sz w:val="19"/>
+                <w:szCs w:val="19"/>
+              </w:rPr>
+              <w:t xml:space="preserve">8 × 28 × 28</w:t>
+            </w:r>
+          </w:p>
+        </w:tc>
+        <w:tc>
+          <w:tcPr>
+            <w:tcW w:type="dxa" w:w="3526"/>
+            <w:shd w:fill="F4F8FA" w:val="clear"/>
+            <w:tcMar>
+              <w:top w:type="dxa" w:w="70"/>
+              <w:left w:type="dxa" w:w="110"/>
+              <w:bottom w:type="dxa" w:w="70"/>
+              <w:right w:type="dxa" w:w="110"/>
+            </w:tcMar>
+          </w:tcPr>
+          <w:p>
+            <w:pPr>
+              <w:spacing w:after="0"/>
+            </w:pPr>
+            <w:r>
+              <w:rPr>
+                <w:rFonts w:ascii="Calibri" w:cs="Calibri" w:eastAsia="Calibri" w:hAnsi="Calibri"/>
+                <w:color w:val="1A2733"/>
+                <w:sz w:val="19"/>
+                <w:szCs w:val="19"/>
+              </w:rPr>
+              <w:t xml:space="preserve">8 × 26 × 26</w:t>
+            </w:r>
+          </w:p>
+        </w:tc>
+      </w:tr>
+      <w:tr>
+        <w:tc>
+          <w:tcPr>
+            <w:tcW w:type="dxa" w:w="1900"/>
+            <w:tcMar>
+              <w:top w:type="dxa" w:w="70"/>
+              <w:left w:type="dxa" w:w="110"/>
+              <w:bottom w:type="dxa" w:w="70"/>
+              <w:right w:type="dxa" w:w="110"/>
+            </w:tcMar>
+          </w:tcPr>
+          <w:p>
+            <w:pPr>
+              <w:spacing w:after="0"/>
+            </w:pPr>
+            <w:r>
+              <w:rPr>
+                <w:rFonts w:ascii="Calibri" w:cs="Calibri" w:eastAsia="Calibri" w:hAnsi="Calibri"/>
+                <w:b/>
+                <w:bCs/>
+                <w:color w:val="1A2733"/>
+                <w:sz w:val="19"/>
+                <w:szCs w:val="19"/>
+              </w:rPr>
+              <w:t xml:space="preserve">pool</w:t>
+            </w:r>
+          </w:p>
+        </w:tc>
+        <w:tc>
+          <w:tcPr>
+            <w:tcW w:type="dxa" w:w="3600"/>
+            <w:tcMar>
+              <w:top w:type="dxa" w:w="70"/>
+              <w:left w:type="dxa" w:w="110"/>
+              <w:bottom w:type="dxa" w:w="70"/>
+              <w:right w:type="dxa" w:w="110"/>
+            </w:tcMar>
+          </w:tcPr>
+          <w:p>
+            <w:pPr>
+              <w:spacing w:after="0"/>
+            </w:pPr>
+            <w:r>
+              <w:rPr>
+                <w:rFonts w:ascii="Calibri" w:cs="Calibri" w:eastAsia="Calibri" w:hAnsi="Calibri"/>
+                <w:color w:val="1A2733"/>
+                <w:sz w:val="19"/>
+                <w:szCs w:val="19"/>
+              </w:rPr>
+              <w:t xml:space="preserve">8 × 14 × 14</w:t>
+            </w:r>
+          </w:p>
+        </w:tc>
+        <w:tc>
+          <w:tcPr>
+            <w:tcW w:type="dxa" w:w="3526"/>
+            <w:tcMar>
+              <w:top w:type="dxa" w:w="70"/>
+              <w:left w:type="dxa" w:w="110"/>
+              <w:bottom w:type="dxa" w:w="70"/>
+              <w:right w:type="dxa" w:w="110"/>
+            </w:tcMar>
+          </w:tcPr>
+          <w:p>
+            <w:pPr>
+              <w:spacing w:after="0"/>
+            </w:pPr>
+            <w:r>
+              <w:rPr>
+                <w:rFonts w:ascii="Calibri" w:cs="Calibri" w:eastAsia="Calibri" w:hAnsi="Calibri"/>
+                <w:color w:val="1A2733"/>
+                <w:sz w:val="19"/>
+                <w:szCs w:val="19"/>
+              </w:rPr>
+              <w:t xml:space="preserve">8 × 13 × 13</w:t>
+            </w:r>
+          </w:p>
+        </w:tc>
+      </w:tr>
+      <w:tr>
+        <w:tc>
+          <w:tcPr>
+            <w:tcW w:type="dxa" w:w="1900"/>
+            <w:shd w:fill="F4F8FA" w:val="clear"/>
+            <w:tcMar>
+              <w:top w:type="dxa" w:w="70"/>
+              <w:left w:type="dxa" w:w="110"/>
+              <w:bottom w:type="dxa" w:w="70"/>
+              <w:right w:type="dxa" w:w="110"/>
+            </w:tcMar>
+          </w:tcPr>
+          <w:p>
+            <w:pPr>
+              <w:spacing w:after="0"/>
+            </w:pPr>
+            <w:r>
+              <w:rPr>
+                <w:rFonts w:ascii="Calibri" w:cs="Calibri" w:eastAsia="Calibri" w:hAnsi="Calibri"/>
+                <w:b/>
+                <w:bCs/>
+                <w:color w:val="1A2733"/>
+                <w:sz w:val="19"/>
+                <w:szCs w:val="19"/>
+              </w:rPr>
+              <w:t xml:space="preserve">conv2</w:t>
+            </w:r>
+          </w:p>
+        </w:tc>
+        <w:tc>
+          <w:tcPr>
+            <w:tcW w:type="dxa" w:w="3600"/>
+            <w:shd w:fill="F4F8FA" w:val="clear"/>
+            <w:tcMar>
+              <w:top w:type="dxa" w:w="70"/>
+              <w:left w:type="dxa" w:w="110"/>
+              <w:bottom w:type="dxa" w:w="70"/>
+              <w:right w:type="dxa" w:w="110"/>
+            </w:tcMar>
+          </w:tcPr>
+          <w:p>
+            <w:pPr>
+              <w:spacing w:after="0"/>
+            </w:pPr>
+            <w:r>
+              <w:rPr>
+                <w:rFonts w:ascii="Calibri" w:cs="Calibri" w:eastAsia="Calibri" w:hAnsi="Calibri"/>
+                <w:color w:val="1A2733"/>
+                <w:sz w:val="19"/>
+                <w:szCs w:val="19"/>
+              </w:rPr>
+              <w:t xml:space="preserve">16 × 14 × 14</w:t>
+            </w:r>
+          </w:p>
+        </w:tc>
+        <w:tc>
+          <w:tcPr>
+            <w:tcW w:type="dxa" w:w="3526"/>
+            <w:shd w:fill="F4F8FA" w:val="clear"/>
+            <w:tcMar>
+              <w:top w:type="dxa" w:w="70"/>
+              <w:left w:type="dxa" w:w="110"/>
+              <w:bottom w:type="dxa" w:w="70"/>
+              <w:right w:type="dxa" w:w="110"/>
+            </w:tcMar>
+          </w:tcPr>
+          <w:p>
+            <w:pPr>
+              <w:spacing w:after="0"/>
+            </w:pPr>
+            <w:r>
+              <w:rPr>
+                <w:rFonts w:ascii="Calibri" w:cs="Calibri" w:eastAsia="Calibri" w:hAnsi="Calibri"/>
+                <w:color w:val="1A2733"/>
+                <w:sz w:val="19"/>
+                <w:szCs w:val="19"/>
+              </w:rPr>
+              <w:t xml:space="preserve">16 × 13 × 13</w:t>
+            </w:r>
+          </w:p>
+        </w:tc>
+      </w:tr>
+      <w:tr>
+        <w:tc>
+          <w:tcPr>
+            <w:tcW w:type="dxa" w:w="1900"/>
+            <w:tcMar>
+              <w:top w:type="dxa" w:w="70"/>
+              <w:left w:type="dxa" w:w="110"/>
+              <w:bottom w:type="dxa" w:w="70"/>
+              <w:right w:type="dxa" w:w="110"/>
+            </w:tcMar>
+          </w:tcPr>
+          <w:p>
+            <w:pPr>
+              <w:spacing w:after="0"/>
+            </w:pPr>
+            <w:r>
+              <w:rPr>
+                <w:rFonts w:ascii="Calibri" w:cs="Calibri" w:eastAsia="Calibri" w:hAnsi="Calibri"/>
+                <w:b/>
+                <w:bCs/>
+                <w:color w:val="1A2733"/>
+                <w:sz w:val="19"/>
+                <w:szCs w:val="19"/>
+              </w:rPr>
+              <w:t xml:space="preserve">pool</w:t>
+            </w:r>
+          </w:p>
+        </w:tc>
+        <w:tc>
+          <w:tcPr>
+            <w:tcW w:type="dxa" w:w="3600"/>
+            <w:tcMar>
+              <w:top w:type="dxa" w:w="70"/>
+              <w:left w:type="dxa" w:w="110"/>
+              <w:bottom w:type="dxa" w:w="70"/>
+              <w:right w:type="dxa" w:w="110"/>
+            </w:tcMar>
+          </w:tcPr>
+          <w:p>
+            <w:pPr>
+              <w:spacing w:after="0"/>
+            </w:pPr>
+            <w:r>
+              <w:rPr>
+                <w:rFonts w:ascii="Calibri" w:cs="Calibri" w:eastAsia="Calibri" w:hAnsi="Calibri"/>
+                <w:color w:val="1A2733"/>
+                <w:sz w:val="19"/>
+                <w:szCs w:val="19"/>
+              </w:rPr>
+              <w:t xml:space="preserve">16 × 7 × 7</w:t>
+            </w:r>
+          </w:p>
+        </w:tc>
+        <w:tc>
+          <w:tcPr>
+            <w:tcW w:type="dxa" w:w="3526"/>
+            <w:tcMar>
+              <w:top w:type="dxa" w:w="70"/>
+              <w:left w:type="dxa" w:w="110"/>
+              <w:bottom w:type="dxa" w:w="70"/>
+              <w:right w:type="dxa" w:w="110"/>
+            </w:tcMar>
+          </w:tcPr>
+          <w:p>
+            <w:pPr>
+              <w:spacing w:after="0"/>
+            </w:pPr>
+            <w:r>
+              <w:rPr>
+                <w:rFonts w:ascii="Calibri" w:cs="Calibri" w:eastAsia="Calibri" w:hAnsi="Calibri"/>
+                <w:color w:val="1A2733"/>
+                <w:sz w:val="19"/>
+                <w:szCs w:val="19"/>
+              </w:rPr>
+              <w:t xml:space="preserve">16 × 6 × 6</w:t>
+            </w:r>
+          </w:p>
+        </w:tc>
+      </w:tr>
+      <w:tr>
+        <w:tc>
+          <w:tcPr>
+            <w:tcW w:type="dxa" w:w="1900"/>
+            <w:shd w:fill="F4F8FA" w:val="clear"/>
+            <w:tcMar>
+              <w:top w:type="dxa" w:w="70"/>
+              <w:left w:type="dxa" w:w="110"/>
+              <w:bottom w:type="dxa" w:w="70"/>
+              <w:right w:type="dxa" w:w="110"/>
+            </w:tcMar>
+          </w:tcPr>
+          <w:p>
+            <w:pPr>
+              <w:spacing w:after="0"/>
+            </w:pPr>
+            <w:r>
+              <w:rPr>
+                <w:rFonts w:ascii="Calibri" w:cs="Calibri" w:eastAsia="Calibri" w:hAnsi="Calibri"/>
+                <w:b/>
+                <w:bCs/>
+                <w:color w:val="1A2733"/>
+                <w:sz w:val="19"/>
+                <w:szCs w:val="19"/>
+              </w:rPr>
+              <w:t xml:space="preserve">conv3</w:t>
+            </w:r>
+          </w:p>
+        </w:tc>
+        <w:tc>
+          <w:tcPr>
+            <w:tcW w:type="dxa" w:w="3600"/>
+            <w:shd w:fill="F4F8FA" w:val="clear"/>
+            <w:tcMar>
+              <w:top w:type="dxa" w:w="70"/>
+              <w:left w:type="dxa" w:w="110"/>
+              <w:bottom w:type="dxa" w:w="70"/>
+              <w:right w:type="dxa" w:w="110"/>
+            </w:tcMar>
+          </w:tcPr>
+          <w:p>
+            <w:pPr>
+              <w:spacing w:after="0"/>
+            </w:pPr>
+            <w:r>
+              <w:rPr>
+                <w:rFonts w:ascii="Calibri" w:cs="Calibri" w:eastAsia="Calibri" w:hAnsi="Calibri"/>
+                <w:color w:val="1A2733"/>
+                <w:sz w:val="19"/>
+                <w:szCs w:val="19"/>
+              </w:rPr>
+              <w:t xml:space="preserve">16 × 7 × 7</w:t>
+            </w:r>
+          </w:p>
+        </w:tc>
+        <w:tc>
+          <w:tcPr>
+            <w:tcW w:type="dxa" w:w="3526"/>
+            <w:shd w:fill="F4F8FA" w:val="clear"/>
+            <w:tcMar>
+              <w:top w:type="dxa" w:w="70"/>
+              <w:left w:type="dxa" w:w="110"/>
+              <w:bottom w:type="dxa" w:w="70"/>
+              <w:right w:type="dxa" w:w="110"/>
+            </w:tcMar>
+          </w:tcPr>
+          <w:p>
+            <w:pPr>
+              <w:spacing w:after="0"/>
+            </w:pPr>
+            <w:r>
+              <w:rPr>
+                <w:rFonts w:ascii="Calibri" w:cs="Calibri" w:eastAsia="Calibri" w:hAnsi="Calibri"/>
+                <w:color w:val="1A2733"/>
+                <w:sz w:val="19"/>
+                <w:szCs w:val="19"/>
+              </w:rPr>
+              <w:t xml:space="preserve">16 × 6 × 6</w:t>
+            </w:r>
+          </w:p>
+        </w:tc>
+      </w:tr>
+      <w:tr>
+        <w:tc>
+          <w:tcPr>
+            <w:tcW w:type="dxa" w:w="1900"/>
+            <w:tcMar>
+              <w:top w:type="dxa" w:w="70"/>
+              <w:left w:type="dxa" w:w="110"/>
+              <w:bottom w:type="dxa" w:w="70"/>
+              <w:right w:type="dxa" w:w="110"/>
+            </w:tcMar>
+          </w:tcPr>
+          <w:p>
+            <w:pPr>
+              <w:spacing w:after="0"/>
+            </w:pPr>
+            <w:r>
+              <w:rPr>
+                <w:rFonts w:ascii="Calibri" w:cs="Calibri" w:eastAsia="Calibri" w:hAnsi="Calibri"/>
+                <w:b/>
+                <w:bCs/>
+                <w:color w:val="1A2733"/>
+                <w:sz w:val="19"/>
+                <w:szCs w:val="19"/>
+              </w:rPr>
+              <w:t xml:space="preserve">pool</w:t>
+            </w:r>
+          </w:p>
+        </w:tc>
+        <w:tc>
+          <w:tcPr>
+            <w:tcW w:type="dxa" w:w="3600"/>
+            <w:tcMar>
+              <w:top w:type="dxa" w:w="70"/>
+              <w:left w:type="dxa" w:w="110"/>
+              <w:bottom w:type="dxa" w:w="70"/>
+              <w:right w:type="dxa" w:w="110"/>
+            </w:tcMar>
+          </w:tcPr>
+          <w:p>
+            <w:pPr>
+              <w:spacing w:after="0"/>
+            </w:pPr>
+            <w:r>
+              <w:rPr>
+                <w:rFonts w:ascii="Calibri" w:cs="Calibri" w:eastAsia="Calibri" w:hAnsi="Calibri"/>
+                <w:color w:val="1A2733"/>
+                <w:sz w:val="19"/>
+                <w:szCs w:val="19"/>
+              </w:rPr>
+              <w:t xml:space="preserve">16 × 3 × 3</w:t>
+            </w:r>
+          </w:p>
+        </w:tc>
+        <w:tc>
+          <w:tcPr>
+            <w:tcW w:type="dxa" w:w="3526"/>
+            <w:tcMar>
+              <w:top w:type="dxa" w:w="70"/>
+              <w:left w:type="dxa" w:w="110"/>
+              <w:bottom w:type="dxa" w:w="70"/>
+              <w:right w:type="dxa" w:w="110"/>
+            </w:tcMar>
+          </w:tcPr>
+          <w:p>
+            <w:pPr>
+              <w:spacing w:after="0"/>
+            </w:pPr>
+            <w:r>
+              <w:rPr>
+                <w:rFonts w:ascii="Calibri" w:cs="Calibri" w:eastAsia="Calibri" w:hAnsi="Calibri"/>
+                <w:color w:val="1A2733"/>
+                <w:sz w:val="19"/>
+                <w:szCs w:val="19"/>
+              </w:rPr>
+              <w:t xml:space="preserve">16 × 3 × 3</w:t>
+            </w:r>
+          </w:p>
+        </w:tc>
+      </w:tr>
+      <w:tr>
+        <w:tc>
+          <w:tcPr>
+            <w:tcW w:type="dxa" w:w="1900"/>
+            <w:shd w:fill="F4F8FA" w:val="clear"/>
+            <w:tcMar>
+              <w:top w:type="dxa" w:w="70"/>
+              <w:left w:type="dxa" w:w="110"/>
+              <w:bottom w:type="dxa" w:w="70"/>
+              <w:right w:type="dxa" w:w="110"/>
+            </w:tcMar>
+          </w:tcPr>
+          <w:p>
+            <w:pPr>
+              <w:spacing w:after="0"/>
+            </w:pPr>
+            <w:r>
+              <w:rPr>
+                <w:rFonts w:ascii="Calibri" w:cs="Calibri" w:eastAsia="Calibri" w:hAnsi="Calibri"/>
+                <w:b/>
+                <w:bCs/>
+                <w:color w:val="1A2733"/>
+                <w:sz w:val="19"/>
+                <w:szCs w:val="19"/>
+              </w:rPr>
+              <w:t xml:space="preserve">flatten</w:t>
+            </w:r>
+          </w:p>
+        </w:tc>
+        <w:tc>
+          <w:tcPr>
+            <w:tcW w:type="dxa" w:w="3600"/>
+            <w:shd w:fill="F4F8FA" w:val="clear"/>
+            <w:tcMar>
+              <w:top w:type="dxa" w:w="70"/>
+              <w:left w:type="dxa" w:w="110"/>
+              <w:bottom w:type="dxa" w:w="70"/>
+              <w:right w:type="dxa" w:w="110"/>
+            </w:tcMar>
+          </w:tcPr>
+          <w:p>
+            <w:pPr>
+              <w:spacing w:after="0"/>
+            </w:pPr>
+            <w:r>
+              <w:rPr>
+                <w:rFonts w:ascii="Calibri" w:cs="Calibri" w:eastAsia="Calibri" w:hAnsi="Calibri"/>
+                <w:color w:val="1A2733"/>
+                <w:sz w:val="19"/>
+                <w:szCs w:val="19"/>
+              </w:rPr>
+              <w:t xml:space="preserve">144</w:t>
+            </w:r>
+          </w:p>
+        </w:tc>
+        <w:tc>
+          <w:tcPr>
+            <w:tcW w:type="dxa" w:w="3526"/>
+            <w:shd w:fill="F4F8FA" w:val="clear"/>
+            <w:tcMar>
+              <w:top w:type="dxa" w:w="70"/>
+              <w:left w:type="dxa" w:w="110"/>
+              <w:bottom w:type="dxa" w:w="70"/>
+              <w:right w:type="dxa" w:w="110"/>
+            </w:tcMar>
+          </w:tcPr>
+          <w:p>
+            <w:pPr>
+              <w:spacing w:after="0"/>
+            </w:pPr>
+            <w:r>
+              <w:rPr>
+                <w:rFonts w:ascii="Calibri" w:cs="Calibri" w:eastAsia="Calibri" w:hAnsi="Calibri"/>
+                <w:color w:val="1A2733"/>
+                <w:sz w:val="19"/>
+                <w:szCs w:val="19"/>
+              </w:rPr>
+              <w:t xml:space="preserve">144 (không đổi)</w:t>
+            </w:r>
+          </w:p>
+        </w:tc>
+      </w:tr>
+      <w:tr>
+        <w:tc>
+          <w:tcPr>
+            <w:tcW w:type="dxa" w:w="1900"/>
+            <w:tcMar>
+              <w:top w:type="dxa" w:w="70"/>
+              <w:left w:type="dxa" w:w="110"/>
+              <w:bottom w:type="dxa" w:w="70"/>
+              <w:right w:type="dxa" w:w="110"/>
+            </w:tcMar>
+          </w:tcPr>
+          <w:p>
+            <w:pPr>
+              <w:spacing w:after="0"/>
+            </w:pPr>
+            <w:r>
+              <w:rPr>
+                <w:rFonts w:ascii="Calibri" w:cs="Calibri" w:eastAsia="Calibri" w:hAnsi="Calibri"/>
+                <w:b/>
+                <w:bCs/>
+                <w:color w:val="1A2733"/>
+                <w:sz w:val="19"/>
+                <w:szCs w:val="19"/>
+              </w:rPr>
+              <w:t xml:space="preserve">TỔNG params</w:t>
+            </w:r>
+          </w:p>
+        </w:tc>
+        <w:tc>
+          <w:tcPr>
+            <w:tcW w:type="dxa" w:w="3600"/>
+            <w:tcMar>
+              <w:top w:type="dxa" w:w="70"/>
+              <w:left w:type="dxa" w:w="110"/>
+              <w:bottom w:type="dxa" w:w="70"/>
+              <w:right w:type="dxa" w:w="110"/>
+            </w:tcMar>
+          </w:tcPr>
+          <w:p>
+            <w:pPr>
+              <w:spacing w:after="0"/>
+            </w:pPr>
+            <w:r>
+              <w:rPr>
+                <w:rFonts w:ascii="Calibri" w:cs="Calibri" w:eastAsia="Calibri" w:hAnsi="Calibri"/>
+                <w:color w:val="1A2733"/>
+                <w:sz w:val="19"/>
+                <w:szCs w:val="19"/>
+              </w:rPr>
+              <w:t xml:space="preserve">5.018</w:t>
+            </w:r>
+          </w:p>
+        </w:tc>
+        <w:tc>
+          <w:tcPr>
+            <w:tcW w:type="dxa" w:w="3526"/>
+            <w:tcMar>
+              <w:top w:type="dxa" w:w="70"/>
+              <w:left w:type="dxa" w:w="110"/>
+              <w:bottom w:type="dxa" w:w="70"/>
+              <w:right w:type="dxa" w:w="110"/>
+            </w:tcMar>
+          </w:tcPr>
+          <w:p>
+            <w:pPr>
+              <w:spacing w:after="0"/>
+            </w:pPr>
+            <w:r>
+              <w:rPr>
+                <w:rFonts w:ascii="Calibri" w:cs="Calibri" w:eastAsia="Calibri" w:hAnsi="Calibri"/>
+                <w:color w:val="1A2733"/>
+                <w:sz w:val="19"/>
+                <w:szCs w:val="19"/>
+              </w:rPr>
+              <w:t xml:space="preserve">5.018 (không đổi)</w:t>
+            </w:r>
+          </w:p>
+        </w:tc>
+      </w:tr>
+    </w:tbl>
+    <w:p>
+      <w:pPr>
+        <w:pBdr>
+          <w:left w:val="single" w:color="1C7293" w:sz="12" w:space="8"/>
+        </w:pBdr>
+        <w:shd w:fill="F7FAFB" w:val="clear"/>
+        <w:spacing w:after="180" w:before="100"/>
+        <w:ind w:left="160" w:right="160"/>
+      </w:pPr>
+      <w:r>
+        <w:rPr>
+          <w:rFonts w:ascii="Calibri" w:cs="Calibri" w:eastAsia="Calibri" w:hAnsi="Calibri"/>
+          <w:i/>
+          <w:iCs/>
+          <w:color w:val="5F7183"/>
+          <w:sz w:val="21"/>
+          <w:szCs w:val="21"/>
+        </w:rPr>
+        <w:t xml:space="preserve">Kết quả ngược trực giác so với mục 6.3: chỉ đổi padding của conv1 KHÔNG làm flatten hay fc thay đổi, dù kích thước trung gian (26 thay vì 28) đã khác. Lý do: qua 3 lần pool (mỗi lần floor chia 2), sai lệch nhỏ ở conv1 bị floor "nuốt" mất trước khi tới flatten — 13 và 14 đều dẫn cùng một kết quả sau khi tiếp tục chia. Bài học: floor không tuyến tính, không được suy diễn tỷ lệ input→output, phải tính lại từng bước.</w:t>
+      </w:r>
+    </w:p>
+    <w:p>
+      <w:pPr>
         <w:pStyle w:val="Heading1"/>
       </w:pPr>
       <w:r>
-        <w:t xml:space="preserve">6. Đọc kết quả</w:t>
+        <w:t xml:space="preserve">7. Đọc kết quả</w:t>
       </w:r>
     </w:p>
     <w:tbl>
@@ -8147,7 +11619,7 @@
         <w:pStyle w:val="Heading2"/>
       </w:pPr>
       <w:r>
-        <w:t xml:space="preserve">6.1 Cắt 41 lần tham số thì model nhầm khác đi thế nào</w:t>
+        <w:t xml:space="preserve">7.1 Cắt 41 lần tham số thì model nhầm khác đi thế nào</w:t>
       </w:r>
     </w:p>
     <w:tbl>
@@ -8762,25 +12234,7 @@
           <w:sz w:val="22"/>
           <w:szCs w:val="22"/>
         </w:rPr>
-        <w:t xml:space="preserve">Thứ nhất, chênh lệch đúng bằng 23 ảnh — khớp với 0,23% chênh accuracy. </w:t>
-      </w:r>
-      <w:r>
-        <w:rPr>
-          <w:rFonts w:ascii="Calibri" w:cs="Calibri" w:eastAsia="Calibri" w:hAnsi="Calibri"/>
-          <w:color w:val="1A2733"/>
-          <w:sz w:val="22"/>
-          <w:szCs w:val="22"/>
-        </w:rPr>
-        <w:t xml:space="preserve">Thứ hai, model nhỏ không kém đều: số 2 từ 98,16% lên 99,13%, số 4 từ 98,67% lên 99,08%; đổi lại số 6 và 9 tụt xuống khoảng 97,9%. </w:t>
-      </w:r>
-      <w:r>
-        <w:rPr>
-          <w:rFonts w:ascii="Calibri" w:cs="Calibri" w:eastAsia="Calibri" w:hAnsi="Calibri"/>
-          <w:color w:val="1A2733"/>
-          <w:sz w:val="22"/>
-          <w:szCs w:val="22"/>
-        </w:rPr>
-        <w:t xml:space="preserve">Thứ ba, cả hai model đều nhầm trong cùng một tập hình dạng — {4,9}, {2,7}, {3,5} — chỉ khác chiều. Nghĩa là các cặp này khó vì bản thân chữ số viết tay giống nhau, không phải vì model yếu. Model nhỏ không “ngu đi” theo kiểu khác, nó chỉ sai thêm ở đúng những chỗ vốn đã khó.</w:t>
+        <w:t xml:space="preserve">Thứ nhất, chênh lệch đúng bằng 23 ảnh — khớp với 0,23% chênh accuracy. Thứ hai, model nhỏ không kém đều: số 2 từ 98,16% lên 99,13%, số 4 từ 98,67% lên 99,08%; đổi lại số 6 và 9 tụt xuống khoảng 97,9%. Thứ ba, cả hai model đều nhầm trong cùng một tập hình dạng — {4,9}, {2,7}, {3,5} — chỉ khác chiều. Nghĩa là các cặp này khó vì bản thân chữ số viết tay giống nhau, không phải vì model yếu. Model nhỏ không “ngu đi” theo kiểu khác, nó chỉ sai thêm ở đúng những chỗ vốn đã khó.</w:t>
       </w:r>
     </w:p>
     <w:p>
@@ -8834,7 +12288,7 @@
         <w:pStyle w:val="Heading1"/>
       </w:pPr>
       <w:r>
-        <w:t xml:space="preserve">7. Bảng tra nhanh</w:t>
+        <w:t xml:space="preserve">8. Bảng tra nhanh</w:t>
       </w:r>
     </w:p>
     <w:tbl>

</xml_diff>